<commit_message>
Regenerate Word doc with restructured PRD
</commit_message>
<xml_diff>
--- a/PRD_SNOWFLAKE_SERVERLESS.docx
+++ b/PRD_SNOWFLAKE_SERVERLESS.docx
@@ -2,7 +2,7 @@
 <file path=word/document.xml><?xml version="1.0" encoding="utf-8"?>
 <w:document xmlns:w="http://schemas.openxmlformats.org/wordprocessingml/2006/main" xmlns:m="http://schemas.openxmlformats.org/officeDocument/2006/math" xmlns:r="http://schemas.openxmlformats.org/officeDocument/2006/relationships" xmlns:o="urn:schemas-microsoft-com:office:office" xmlns:v="urn:schemas-microsoft-com:vml" xmlns:w10="urn:schemas-microsoft-com:office:word" xmlns:a="http://schemas.openxmlformats.org/drawingml/2006/main" xmlns:pic="http://schemas.openxmlformats.org/drawingml/2006/picture" xmlns:wp="http://schemas.openxmlformats.org/drawingml/2006/wordprocessingDrawing">
   <w:body>
-    <w:bookmarkStart w:id="151" w:name="X4c274947e34e9242b3a3be0477196345b9c3d02"/>
+    <w:bookmarkStart w:id="157" w:name="X4c274947e34e9242b3a3be0477196345b9c3d02"/>
     <w:p>
       <w:pPr>
         <w:pStyle w:val="Heading1"/>
@@ -90,7 +90,7 @@
         <w:t xml:space="preserve"> </w:t>
       </w:r>
       <w:r>
-        <w:t xml:space="preserve">Approve funding and prioritize for H1 2026</w:t>
+        <w:t xml:space="preserve">Approve $2.5M funding and prioritize for H1 2026</w:t>
       </w:r>
     </w:p>
     <w:p>
@@ -100,107 +100,286 @@
         </w:pict>
       </w:r>
     </w:p>
-    <w:bookmarkStart w:id="19" w:name="executive-summary-for-leadership"/>
+    <w:bookmarkStart w:id="9" w:name="how-to-read-this-prd"/>
     <w:p>
       <w:pPr>
         <w:pStyle w:val="Heading2"/>
       </w:pPr>
       <w:r>
-        <w:t xml:space="preserve">Executive Summary (For Leadership)</w:t>
-      </w:r>
-    </w:p>
-    <w:bookmarkStart w:id="9" w:name="the-ask"/>
-    <w:p>
-      <w:pPr>
-        <w:pStyle w:val="Heading3"/>
-      </w:pPr>
-      <w:r>
-        <w:t xml:space="preserve">The Ask</w:t>
+        <w:t xml:space="preserve">📖 HOW TO READ THIS PRD</w:t>
       </w:r>
     </w:p>
     <w:p>
       <w:pPr>
         <w:pStyle w:val="FirstParagraph"/>
       </w:pPr>
-      <w:r>
-        <w:t xml:space="preserve">Approve</w:t>
-      </w:r>
-      <w:r>
-        <w:t xml:space="preserve"> </w:t>
-      </w:r>
       <w:r>
         <w:rPr>
           <w:b/>
           <w:bCs/>
         </w:rPr>
-        <w:t xml:space="preserve">$2.5M investment</w:t>
-      </w:r>
-      <w:r>
-        <w:t xml:space="preserve"> </w:t>
-      </w:r>
-      <w:r>
-        <w:t xml:space="preserve">(10 FTEs × 12 months) to build a serverless compute interface that eliminates infrastructure complexity for internal teams, accelerating feature delivery and positioning Snowflake to compete with AWS Lambda and Modal.ai.</w:t>
-      </w:r>
-    </w:p>
-    <w:bookmarkEnd w:id="9"/>
-    <w:bookmarkStart w:id="10" w:name="the-problem"/>
-    <w:p>
-      <w:pPr>
-        <w:pStyle w:val="Heading3"/>
-      </w:pPr>
-      <w:r>
-        <w:t xml:space="preserve">The Problem</w:t>
-      </w:r>
-    </w:p>
-    <w:p>
-      <w:pPr>
-        <w:pStyle w:val="FirstParagraph"/>
-      </w:pPr>
-      <w:r>
-        <w:t xml:space="preserve">Internal teams (Notebooks, Streamlit, Cortex) waste</w:t>
-      </w:r>
-      <w:r>
-        <w:t xml:space="preserve"> </w:t>
-      </w:r>
+        <w:t xml:space="preserve">For Busy Executives (5-10 minutes):</w:t>
+      </w:r>
+      <w:r>
+        <w:t xml:space="preserve"> </w:t>
+      </w:r>
+      <w:r>
+        <w:t xml:space="preserve">Read</w:t>
+      </w:r>
+      <w:r>
+        <w:t xml:space="preserve"> </w:t>
+      </w:r>
+      <w:r>
+        <w:t xml:space="preserve">“Executive Summary”</w:t>
+      </w:r>
+      <w:r>
+        <w:t xml:space="preserve"> </w:t>
+      </w:r>
+      <w:r>
+        <w:t xml:space="preserve">only - contains the ask, problem, solution, financials, and recommendation.</w:t>
+      </w:r>
+    </w:p>
+    <w:p>
+      <w:pPr>
+        <w:pStyle w:val="BodyText"/>
+      </w:pPr>
       <w:r>
         <w:rPr>
           <w:b/>
           <w:bCs/>
         </w:rPr>
-        <w:t xml:space="preserve">40% of engineering time</w:t>
-      </w:r>
-      <w:r>
-        <w:t xml:space="preserve"> </w:t>
-      </w:r>
-      <w:r>
-        <w:t xml:space="preserve">managing SPCS infrastructure instead of building features. Current deployment requires 50+ lines of code, 30+ minutes, and deep infrastructure knowledge. Teams are locked into Kubernetes containers with no path to adopt faster execution models (microVMs, Firecracker).</w:t>
-      </w:r>
-    </w:p>
-    <w:bookmarkEnd w:id="10"/>
-    <w:bookmarkStart w:id="11" w:name="the-solution"/>
-    <w:p>
-      <w:pPr>
-        <w:pStyle w:val="Heading3"/>
-      </w:pPr>
-      <w:r>
-        <w:t xml:space="preserve">The Solution</w:t>
-      </w:r>
-    </w:p>
-    <w:p>
-      <w:pPr>
-        <w:pStyle w:val="FirstParagraph"/>
-      </w:pPr>
-      <w:r>
-        <w:t xml:space="preserve">Build a</w:t>
-      </w:r>
-      <w:r>
-        <w:t xml:space="preserve"> </w:t>
-      </w:r>
+        <w:t xml:space="preserve">For Product/Engineering Leaders (20-30 minutes):</w:t>
+      </w:r>
+      <w:r>
+        <w:t xml:space="preserve"> </w:t>
+      </w:r>
+      <w:r>
+        <w:t xml:space="preserve">Read Executive Summary + Sections 1-4:</w:t>
+      </w:r>
+      <w:r>
+        <w:t xml:space="preserve"> </w:t>
+      </w:r>
+      <w:r>
+        <w:t xml:space="preserve">- Section 1: Detailed problem statement with evidence</w:t>
+      </w:r>
+      <w:r>
+        <w:t xml:space="preserve"> </w:t>
+      </w:r>
+      <w:r>
+        <w:t xml:space="preserve">- Section 2: Current state analysis (how teams struggle today)</w:t>
+      </w:r>
+      <w:r>
+        <w:t xml:space="preserve"> </w:t>
+      </w:r>
+      <w:r>
+        <w:t xml:space="preserve">- Section 3: Goals and requirements (what we must build and why)</w:t>
+      </w:r>
+      <w:r>
+        <w:t xml:space="preserve"> </w:t>
+      </w:r>
+      <w:r>
+        <w:t xml:space="preserve">- Section 4: User personas and use cases (who needs what)</w:t>
+      </w:r>
+    </w:p>
+    <w:p>
+      <w:pPr>
+        <w:pStyle w:val="BodyText"/>
+      </w:pPr>
       <w:r>
         <w:rPr>
           <w:b/>
           <w:bCs/>
         </w:rPr>
+        <w:t xml:space="preserve">For Engineers/Architects (1-2 hours):</w:t>
+      </w:r>
+      <w:r>
+        <w:t xml:space="preserve"> </w:t>
+      </w:r>
+      <w:r>
+        <w:t xml:space="preserve">Read Sections 1-10:</w:t>
+      </w:r>
+      <w:r>
+        <w:t xml:space="preserve"> </w:t>
+      </w:r>
+      <w:r>
+        <w:t xml:space="preserve">- Understand problem and requirements (Sections 1-4)</w:t>
+      </w:r>
+      <w:r>
+        <w:t xml:space="preserve"> </w:t>
+      </w:r>
+      <w:r>
+        <w:t xml:space="preserve">- Review proposed solution and architecture (Sections 5-7)</w:t>
+      </w:r>
+      <w:r>
+        <w:t xml:space="preserve"> </w:t>
+      </w:r>
+      <w:r>
+        <w:t xml:space="preserve">- Study implementation details and design decisions (Sections 8-10)</w:t>
+      </w:r>
+    </w:p>
+    <w:p>
+      <w:pPr>
+        <w:pStyle w:val="BodyText"/>
+      </w:pPr>
+      <w:r>
+        <w:rPr>
+          <w:b/>
+          <w:bCs/>
+        </w:rPr>
+        <w:t xml:space="preserve">For Finance/Operations (15-20 minutes):</w:t>
+      </w:r>
+      <w:r>
+        <w:t xml:space="preserve"> </w:t>
+      </w:r>
+      <w:r>
+        <w:t xml:space="preserve">Read Executive Summary + Sections 11-13:</w:t>
+      </w:r>
+      <w:r>
+        <w:t xml:space="preserve"> </w:t>
+      </w:r>
+      <w:r>
+        <w:t xml:space="preserve">- Section 11: Team composition and resource requirements</w:t>
+      </w:r>
+      <w:r>
+        <w:t xml:space="preserve"> </w:t>
+      </w:r>
+      <w:r>
+        <w:t xml:space="preserve">- Section 12: Financial analysis and ROI calculation</w:t>
+      </w:r>
+      <w:r>
+        <w:t xml:space="preserve"> </w:t>
+      </w:r>
+      <w:r>
+        <w:t xml:space="preserve">- Section 13: Risk assessment and mitigation plans</w:t>
+      </w:r>
+    </w:p>
+    <w:p>
+      <w:pPr>
+        <w:pStyle w:val="BodyText"/>
+      </w:pPr>
+      <w:r>
+        <w:rPr>
+          <w:b/>
+          <w:bCs/>
+        </w:rPr>
+        <w:t xml:space="preserve">Document Flow:</w:t>
+      </w:r>
+      <w:r>
+        <w:t xml:space="preserve"> </w:t>
+      </w:r>
+      <w:r>
+        <w:t xml:space="preserve">Problem &amp; Requirements → Solution &amp; Architecture → Implementation Plan → Team &amp; Budget → ROI &amp; Risks</w:t>
+      </w:r>
+    </w:p>
+    <w:p>
+      <w:r>
+        <w:pict>
+          <v:rect style="width:0;height:1.5pt" o:hralign="center" o:hrstd="t" o:hr="t"/>
+        </w:pict>
+      </w:r>
+    </w:p>
+    <w:bookmarkEnd w:id="9"/>
+    <w:bookmarkStart w:id="20" w:name="executive-summary-for-leadership"/>
+    <w:p>
+      <w:pPr>
+        <w:pStyle w:val="Heading2"/>
+      </w:pPr>
+      <w:r>
+        <w:t xml:space="preserve">Executive Summary (For Leadership)</w:t>
+      </w:r>
+    </w:p>
+    <w:bookmarkStart w:id="10" w:name="the-ask"/>
+    <w:p>
+      <w:pPr>
+        <w:pStyle w:val="Heading3"/>
+      </w:pPr>
+      <w:r>
+        <w:t xml:space="preserve">The Ask</w:t>
+      </w:r>
+    </w:p>
+    <w:p>
+      <w:pPr>
+        <w:pStyle w:val="FirstParagraph"/>
+      </w:pPr>
+      <w:r>
+        <w:t xml:space="preserve">Approve</w:t>
+      </w:r>
+      <w:r>
+        <w:t xml:space="preserve"> </w:t>
+      </w:r>
+      <w:r>
+        <w:rPr>
+          <w:b/>
+          <w:bCs/>
+        </w:rPr>
+        <w:t xml:space="preserve">$2.5M investment</w:t>
+      </w:r>
+      <w:r>
+        <w:t xml:space="preserve"> </w:t>
+      </w:r>
+      <w:r>
+        <w:t xml:space="preserve">(10 FTEs × 12 months) to build a serverless compute interface that eliminates infrastructure complexity for internal teams, accelerating feature delivery and positioning Snowflake to compete with AWS Lambda and Modal.ai.</w:t>
+      </w:r>
+    </w:p>
+    <w:bookmarkEnd w:id="10"/>
+    <w:bookmarkStart w:id="11" w:name="the-problem"/>
+    <w:p>
+      <w:pPr>
+        <w:pStyle w:val="Heading3"/>
+      </w:pPr>
+      <w:r>
+        <w:t xml:space="preserve">The Problem</w:t>
+      </w:r>
+    </w:p>
+    <w:p>
+      <w:pPr>
+        <w:pStyle w:val="FirstParagraph"/>
+      </w:pPr>
+      <w:r>
+        <w:t xml:space="preserve">Internal teams (Notebooks, Streamlit, Cortex) waste</w:t>
+      </w:r>
+      <w:r>
+        <w:t xml:space="preserve"> </w:t>
+      </w:r>
+      <w:r>
+        <w:rPr>
+          <w:b/>
+          <w:bCs/>
+        </w:rPr>
+        <w:t xml:space="preserve">40% of engineering time</w:t>
+      </w:r>
+      <w:r>
+        <w:t xml:space="preserve"> </w:t>
+      </w:r>
+      <w:r>
+        <w:t xml:space="preserve">managing SPCS infrastructure instead of building features. Current deployment requires 50+ lines of code, 30+ minutes, and deep infrastructure knowledge. Teams are locked into Kubernetes containers with no path to adopt faster execution models (microVMs, Firecracker).</w:t>
+      </w:r>
+    </w:p>
+    <w:bookmarkEnd w:id="11"/>
+    <w:bookmarkStart w:id="12" w:name="the-solution"/>
+    <w:p>
+      <w:pPr>
+        <w:pStyle w:val="Heading3"/>
+      </w:pPr>
+      <w:r>
+        <w:t xml:space="preserve">The Solution</w:t>
+      </w:r>
+    </w:p>
+    <w:p>
+      <w:pPr>
+        <w:pStyle w:val="FirstParagraph"/>
+      </w:pPr>
+      <w:r>
+        <w:t xml:space="preserve">Build a</w:t>
+      </w:r>
+      <w:r>
+        <w:t xml:space="preserve"> </w:t>
+      </w:r>
+      <w:r>
+        <w:rPr>
+          <w:b/>
+          <w:bCs/>
+        </w:rPr>
         <w:t xml:space="preserve">unified serverless interface</w:t>
       </w:r>
       <w:r>
@@ -246,8 +425,8 @@
         <w:t xml:space="preserve">- Provides automatic scaling, monitoring, and cost attribution</w:t>
       </w:r>
     </w:p>
-    <w:bookmarkEnd w:id="11"/>
-    <w:bookmarkStart w:id="12" w:name="business-case"/>
+    <w:bookmarkEnd w:id="12"/>
+    <w:bookmarkStart w:id="13" w:name="business-case"/>
     <w:p>
       <w:pPr>
         <w:pStyle w:val="Heading3"/>
@@ -523,8 +702,8 @@
         </w:tc>
       </w:tr>
     </w:tbl>
-    <w:bookmarkEnd w:id="12"/>
-    <w:bookmarkStart w:id="13" w:name="financial-summary"/>
+    <w:bookmarkEnd w:id="13"/>
+    <w:bookmarkStart w:id="14" w:name="financial-summary"/>
     <w:p>
       <w:pPr>
         <w:pStyle w:val="Heading3"/>
@@ -779,8 +958,8 @@
         </w:tc>
       </w:tr>
     </w:tbl>
-    <w:bookmarkEnd w:id="13"/>
-    <w:bookmarkStart w:id="14" w:name="timeline"/>
+    <w:bookmarkEnd w:id="14"/>
+    <w:bookmarkStart w:id="15" w:name="timeline"/>
     <w:p>
       <w:pPr>
         <w:pStyle w:val="Heading3"/>
@@ -877,8 +1056,8 @@
         <w:t xml:space="preserve">(Months 9-12): Alternative backends - microVM experimentation</w:t>
       </w:r>
     </w:p>
-    <w:bookmarkEnd w:id="14"/>
-    <w:bookmarkStart w:id="15" w:name="key-risks-mitigations"/>
+    <w:bookmarkEnd w:id="15"/>
+    <w:bookmarkStart w:id="16" w:name="key-risks-mitigations"/>
     <w:p>
       <w:pPr>
         <w:pStyle w:val="Heading3"/>
@@ -975,8 +1154,8 @@
         <w:t xml:space="preserve">→ Gradual rollout, automatic fallback, extensive testing</w:t>
       </w:r>
     </w:p>
-    <w:bookmarkEnd w:id="15"/>
-    <w:bookmarkStart w:id="16" w:name="success-metrics-6-months-post-ga"/>
+    <w:bookmarkEnd w:id="16"/>
+    <w:bookmarkStart w:id="17" w:name="success-metrics-6-months-post-ga"/>
     <w:p>
       <w:pPr>
         <w:pStyle w:val="Heading3"/>
@@ -1045,8 +1224,8 @@
         <w:t xml:space="preserve">Zero backend migration time (when SPCS → microVM)</w:t>
       </w:r>
     </w:p>
-    <w:bookmarkEnd w:id="16"/>
-    <w:bookmarkStart w:id="17" w:name="why-now"/>
+    <w:bookmarkEnd w:id="17"/>
+    <w:bookmarkStart w:id="18" w:name="why-now"/>
     <w:p>
       <w:pPr>
         <w:pStyle w:val="Heading3"/>
@@ -1131,8 +1310,8 @@
         <w:t xml:space="preserve">: Enables Snowflake’s AI/ML product strategy</w:t>
       </w:r>
     </w:p>
-    <w:bookmarkEnd w:id="17"/>
-    <w:bookmarkStart w:id="18" w:name="alternatives-considered"/>
+    <w:bookmarkEnd w:id="18"/>
+    <w:bookmarkStart w:id="19" w:name="alternatives-considered"/>
     <w:p>
       <w:pPr>
         <w:pStyle w:val="Heading3"/>
@@ -1220,9 +1399,9 @@
         </w:pict>
       </w:r>
     </w:p>
-    <w:bookmarkEnd w:id="18"/>
     <w:bookmarkEnd w:id="19"/>
-    <w:bookmarkStart w:id="25" w:name="background-key-concepts-for-non-experts"/>
+    <w:bookmarkEnd w:id="20"/>
+    <w:bookmarkStart w:id="26" w:name="background-key-concepts-for-non-experts"/>
     <w:p>
       <w:pPr>
         <w:pStyle w:val="Heading2"/>
@@ -1231,7 +1410,7 @@
         <w:t xml:space="preserve">Background: Key Concepts for Non-Experts</w:t>
       </w:r>
     </w:p>
-    <w:bookmarkStart w:id="20" w:name="what-is-spcs"/>
+    <w:bookmarkStart w:id="21" w:name="what-is-spcs"/>
     <w:p>
       <w:pPr>
         <w:pStyle w:val="Heading3"/>
@@ -1332,8 +1511,8 @@
         <w:t xml:space="preserve">This is complex and time-consuming.</w:t>
       </w:r>
     </w:p>
-    <w:bookmarkEnd w:id="20"/>
-    <w:bookmarkStart w:id="21" w:name="what-is-serverless"/>
+    <w:bookmarkEnd w:id="21"/>
+    <w:bookmarkStart w:id="22" w:name="what-is-serverless"/>
     <w:p>
       <w:pPr>
         <w:pStyle w:val="Heading3"/>
@@ -1395,8 +1574,8 @@
         <w:t xml:space="preserve">You only pay for execution time, not idle servers.</w:t>
       </w:r>
     </w:p>
-    <w:bookmarkEnd w:id="21"/>
-    <w:bookmarkStart w:id="22" w:name="X8c64ec26a9c51eb8133424e96156a01146b86cb"/>
+    <w:bookmarkEnd w:id="22"/>
+    <w:bookmarkStart w:id="23" w:name="X8c64ec26a9c51eb8133424e96156a01146b86cb"/>
     <w:p>
       <w:pPr>
         <w:pStyle w:val="Heading3"/>
@@ -1468,8 +1647,8 @@
         <w:t xml:space="preserve">: Sandboxed code that runs near-native speed. Strongest isolation. Start time: &lt;100ms.</w:t>
       </w:r>
     </w:p>
-    <w:bookmarkEnd w:id="22"/>
-    <w:bookmarkStart w:id="23" w:name="why-does-execution-model-matter"/>
+    <w:bookmarkEnd w:id="23"/>
+    <w:bookmarkStart w:id="24" w:name="why-does-execution-model-matter"/>
     <w:p>
       <w:pPr>
         <w:pStyle w:val="Heading3"/>
@@ -1499,8 +1678,8 @@
         <w:t xml:space="preserve">—the platform can switch backends transparently.</w:t>
       </w:r>
     </w:p>
-    <w:bookmarkEnd w:id="23"/>
-    <w:bookmarkStart w:id="24" w:name="what-is-openflow"/>
+    <w:bookmarkEnd w:id="24"/>
+    <w:bookmarkStart w:id="25" w:name="what-is-openflow"/>
     <w:p>
       <w:pPr>
         <w:pStyle w:val="Heading3"/>
@@ -1543,24 +1722,24 @@
         </w:pict>
       </w:r>
     </w:p>
-    <w:bookmarkEnd w:id="24"/>
     <w:bookmarkEnd w:id="25"/>
-    <w:bookmarkStart w:id="29" w:name="executive-summary"/>
+    <w:bookmarkEnd w:id="26"/>
+    <w:bookmarkStart w:id="31" w:name="problem-statement-detailed"/>
     <w:p>
       <w:pPr>
         <w:pStyle w:val="Heading2"/>
       </w:pPr>
       <w:r>
-        <w:t xml:space="preserve">1. Executive Summary</w:t>
-      </w:r>
-    </w:p>
-    <w:bookmarkStart w:id="26" w:name="problem-statement"/>
+        <w:t xml:space="preserve">1. Problem Statement (Detailed)</w:t>
+      </w:r>
+    </w:p>
+    <w:bookmarkStart w:id="27" w:name="X39a1175f0ccaa2ccca6a83a1b0a6525c31392dd"/>
     <w:p>
       <w:pPr>
         <w:pStyle w:val="Heading3"/>
       </w:pPr>
       <w:r>
-        <w:t xml:space="preserve">1.1 Problem Statement</w:t>
+        <w:t xml:space="preserve">1.1 The Core Problem: Infrastructure Complexity Slows Feature Delivery</w:t>
       </w:r>
     </w:p>
     <w:p>
@@ -1568,7 +1747,123 @@
         <w:pStyle w:val="FirstParagraph"/>
       </w:pPr>
       <w:r>
-        <w:t xml:space="preserve">Internal Snowflake teams (Notebooks vNext, Streamlit/SiS, Cortex) spend significant engineering effort managing SPCS infrastructure instead of building product features. Currently, deploying code to SPCS requires:</w:t>
+        <w:t xml:space="preserve">Internal Snowflake teams (Notebooks vNext, Streamlit/SiS, Cortex) spend</w:t>
+      </w:r>
+      <w:r>
+        <w:t xml:space="preserve"> </w:t>
+      </w:r>
+      <w:r>
+        <w:rPr>
+          <w:b/>
+          <w:bCs/>
+        </w:rPr>
+        <w:t xml:space="preserve">40% of engineering time</w:t>
+      </w:r>
+      <w:r>
+        <w:t xml:space="preserve"> </w:t>
+      </w:r>
+      <w:r>
+        <w:t xml:space="preserve">managing SPCS infrastructure instead of building product features.</w:t>
+      </w:r>
+    </w:p>
+    <w:p>
+      <w:pPr>
+        <w:pStyle w:val="BodyText"/>
+      </w:pPr>
+      <w:r>
+        <w:rPr>
+          <w:b/>
+          <w:bCs/>
+        </w:rPr>
+        <w:t xml:space="preserve">What deploying to SPCS requires today:</w:t>
+      </w:r>
+      <w:r>
+        <w:t xml:space="preserve"> </w:t>
+      </w:r>
+      <w:r>
+        <w:t xml:space="preserve">- Writing 50+ lines of ServiceSpec YAML</w:t>
+      </w:r>
+      <w:r>
+        <w:t xml:space="preserve"> </w:t>
+      </w:r>
+      <w:r>
+        <w:t xml:space="preserve">- Creating and managing compute pools (sizing, auto-suspend configuration)</w:t>
+      </w:r>
+      <w:r>
+        <w:t xml:space="preserve"> </w:t>
+      </w:r>
+      <w:r>
+        <w:t xml:space="preserve">- Building, pushing, and versioning container images</w:t>
+      </w:r>
+      <w:r>
+        <w:t xml:space="preserve"> </w:t>
+      </w:r>
+      <w:r>
+        <w:t xml:space="preserve">- Implementing token refresh logic (60-minute OAuth expiry)</w:t>
+      </w:r>
+      <w:r>
+        <w:t xml:space="preserve"> </w:t>
+      </w:r>
+      <w:r>
+        <w:t xml:space="preserve">- Estimating CPU/memory/GPU requirements without tooling</w:t>
+      </w:r>
+      <w:r>
+        <w:t xml:space="preserve"> </w:t>
+      </w:r>
+      <w:r>
+        <w:t xml:space="preserve">- Configuring networking, endpoints, volumes, secrets</w:t>
+      </w:r>
+      <w:r>
+        <w:t xml:space="preserve"> </w:t>
+      </w:r>
+      <w:r>
+        <w:t xml:space="preserve">- Managing service lifecycle, monitoring, and debugging</w:t>
+      </w:r>
+    </w:p>
+    <w:p>
+      <w:pPr>
+        <w:pStyle w:val="BodyText"/>
+      </w:pPr>
+      <w:r>
+        <w:rPr>
+          <w:b/>
+          <w:bCs/>
+        </w:rPr>
+        <w:t xml:space="preserve">Result:</w:t>
+      </w:r>
+      <w:r>
+        <w:t xml:space="preserve"> </w:t>
+      </w:r>
+      <w:r>
+        <w:t xml:space="preserve">A 5-line Python function takes 30+ minutes and 50+ lines of infrastructure code to deploy.</w:t>
+      </w:r>
+    </w:p>
+    <w:bookmarkEnd w:id="27"/>
+    <w:bookmarkStart w:id="28" w:name="X26901e340f9ea0f948861a2476d01b685bbf233"/>
+    <w:p>
+      <w:pPr>
+        <w:pStyle w:val="Heading3"/>
+      </w:pPr>
+      <w:r>
+        <w:t xml:space="preserve">1.2 Architectural Lock-In Prevents Innovation</w:t>
+      </w:r>
+    </w:p>
+    <w:p>
+      <w:pPr>
+        <w:pStyle w:val="FirstParagraph"/>
+      </w:pPr>
+      <w:r>
+        <w:rPr>
+          <w:b/>
+          <w:bCs/>
+        </w:rPr>
+        <w:t xml:space="preserve">SPCS locks teams into the current container-based architecture (Kubernetes).</w:t>
+      </w:r>
+      <w:r>
+        <w:t xml:space="preserve"> </w:t>
+      </w:r>
+      <w:r>
+        <w:t xml:space="preserve">There is no easy way to experiment with alternative execution models without requiring every consumer team to rewrite their integration code:</w:t>
       </w:r>
     </w:p>
     <w:p>
@@ -1580,7 +1875,17 @@
         </w:numPr>
       </w:pPr>
       <w:r>
-        <w:t xml:space="preserve">Writing 50+ lines of ServiceSpec YAML</w:t>
+        <w:rPr>
+          <w:b/>
+          <w:bCs/>
+        </w:rPr>
+        <w:t xml:space="preserve">microVMs</w:t>
+      </w:r>
+      <w:r>
+        <w:t xml:space="preserve"> </w:t>
+      </w:r>
+      <w:r>
+        <w:t xml:space="preserve">(Firecracker, gVisor): 10x faster cold starts (&lt;1s vs 30s), stronger isolation</w:t>
       </w:r>
     </w:p>
     <w:p>
@@ -1592,7 +1897,14 @@
         </w:numPr>
       </w:pPr>
       <w:r>
-        <w:t xml:space="preserve">Creating and managing compute pools</w:t>
+        <w:rPr>
+          <w:b/>
+          <w:bCs/>
+        </w:rPr>
+        <w:t xml:space="preserve">WebAssembly</w:t>
+      </w:r>
+      <w:r>
+        <w:t xml:space="preserve">: Near-native speed, extreme isolation for untrusted code</w:t>
       </w:r>
     </w:p>
     <w:p>
@@ -1604,7 +1916,14 @@
         </w:numPr>
       </w:pPr>
       <w:r>
-        <w:t xml:space="preserve">Building, pushing, and versioning container images</w:t>
+        <w:rPr>
+          <w:b/>
+          <w:bCs/>
+        </w:rPr>
+        <w:t xml:space="preserve">Bare metal GPU</w:t>
+      </w:r>
+      <w:r>
+        <w:t xml:space="preserve">: Better utilization for large ML models</w:t>
       </w:r>
     </w:p>
     <w:p>
@@ -1616,70 +1935,263 @@
         </w:numPr>
       </w:pPr>
       <w:r>
-        <w:t xml:space="preserve">Implementing token refresh logic (60-min OAuth expiry)</w:t>
-      </w:r>
-    </w:p>
-    <w:p>
-      <w:pPr>
-        <w:pStyle w:val="Compact"/>
-        <w:numPr>
-          <w:ilvl w:val="0"/>
-          <w:numId w:val="1007"/>
-        </w:numPr>
-      </w:pPr>
-      <w:r>
-        <w:t xml:space="preserve">Estimating CPU/memory/GPU requirements</w:t>
-      </w:r>
-    </w:p>
-    <w:p>
-      <w:pPr>
-        <w:pStyle w:val="FirstParagraph"/>
-      </w:pPr>
-      <w:r>
         <w:rPr>
           <w:b/>
           <w:bCs/>
         </w:rPr>
-        <w:t xml:space="preserve">This infrastructure burden slows down development and creates inconsistent patterns across teams.</w:t>
-      </w:r>
-    </w:p>
+        <w:t xml:space="preserve">Future technologies</w:t>
+      </w:r>
+      <w:r>
+        <w:t xml:space="preserve">: No path to adopt innovations as they emerge</w:t>
+      </w:r>
+    </w:p>
+    <w:p>
+      <w:pPr>
+        <w:pStyle w:val="FirstParagraph"/>
+      </w:pPr>
+      <w:r>
+        <w:t xml:space="preserve">Teams currently hard-code SPCS APIs (ServiceSpec, compute pools, image registries) into their products. Migrating to a better backend means weeks of rewriting for every team.</w:t>
+      </w:r>
+    </w:p>
+    <w:bookmarkEnd w:id="28"/>
+    <w:bookmarkStart w:id="29" w:name="who-is-affected-and-how"/>
+    <w:p>
+      <w:pPr>
+        <w:pStyle w:val="Heading3"/>
+      </w:pPr>
+      <w:r>
+        <w:t xml:space="preserve">1.3 Who Is Affected and How</w:t>
+      </w:r>
+    </w:p>
+    <w:tbl>
+      <w:tblPr>
+        <w:tblStyle w:val="Table"/>
+        <w:tblW w:type="pct" w:w="5000"/>
+        <w:tblLayout w:type="fixed"/>
+        <w:tblLook w:firstRow="1" w:lastRow="0" w:firstColumn="0" w:lastColumn="0" w:noHBand="0" w:noVBand="0" w:val="0020"/>
+      </w:tblPr>
+      <w:tblGrid>
+        <w:gridCol w:w="1159"/>
+        <w:gridCol w:w="2704"/>
+        <w:gridCol w:w="2511"/>
+        <w:gridCol w:w="1545"/>
+      </w:tblGrid>
+      <w:tr>
+        <w:trPr>
+          <w:tblHeader w:val="on"/>
+        </w:trPr>
+        <w:tc>
+          <w:tcPr/>
+          <w:p>
+            <w:pPr>
+              <w:pStyle w:val="Compact"/>
+            </w:pPr>
+            <w:r>
+              <w:t xml:space="preserve">Team</w:t>
+            </w:r>
+          </w:p>
+        </w:tc>
+        <w:tc>
+          <w:tcPr/>
+          <w:p>
+            <w:pPr>
+              <w:pStyle w:val="Compact"/>
+            </w:pPr>
+            <w:r>
+              <w:t xml:space="preserve">Current Pain</w:t>
+            </w:r>
+          </w:p>
+        </w:tc>
+        <w:tc>
+          <w:tcPr/>
+          <w:p>
+            <w:pPr>
+              <w:pStyle w:val="Compact"/>
+            </w:pPr>
+            <w:r>
+              <w:t xml:space="preserve">Time Wasted</w:t>
+            </w:r>
+          </w:p>
+        </w:tc>
+        <w:tc>
+          <w:tcPr/>
+          <w:p>
+            <w:pPr>
+              <w:pStyle w:val="Compact"/>
+            </w:pPr>
+            <w:r>
+              <w:t xml:space="preserve">Impact</w:t>
+            </w:r>
+          </w:p>
+        </w:tc>
+      </w:tr>
+      <w:tr>
+        <w:tc>
+          <w:tcPr/>
+          <w:p>
+            <w:pPr>
+              <w:pStyle w:val="Compact"/>
+            </w:pPr>
+            <w:r>
+              <w:rPr>
+                <w:b/>
+                <w:bCs/>
+              </w:rPr>
+              <w:t xml:space="preserve">Notebooks vNext</w:t>
+            </w:r>
+          </w:p>
+        </w:tc>
+        <w:tc>
+          <w:tcPr/>
+          <w:p>
+            <w:pPr>
+              <w:pStyle w:val="Compact"/>
+            </w:pPr>
+            <w:r>
+              <w:t xml:space="preserve">ServiceSpec for every notebook, token refresh, GPU pool management</w:t>
+            </w:r>
+          </w:p>
+        </w:tc>
+        <w:tc>
+          <w:tcPr/>
+          <w:p>
+            <w:pPr>
+              <w:pStyle w:val="Compact"/>
+            </w:pPr>
+            <w:r>
+              <w:t xml:space="preserve">40% of 2 eng (1,600 hours/year)</w:t>
+            </w:r>
+          </w:p>
+        </w:tc>
+        <w:tc>
+          <w:tcPr/>
+          <w:p>
+            <w:pPr>
+              <w:pStyle w:val="Compact"/>
+            </w:pPr>
+            <w:r>
+              <w:t xml:space="preserve">Delayed interactive notebook features</w:t>
+            </w:r>
+          </w:p>
+        </w:tc>
+      </w:tr>
+      <w:tr>
+        <w:tc>
+          <w:tcPr/>
+          <w:p>
+            <w:pPr>
+              <w:pStyle w:val="Compact"/>
+            </w:pPr>
+            <w:r>
+              <w:rPr>
+                <w:b/>
+                <w:bCs/>
+              </w:rPr>
+              <w:t xml:space="preserve">Streamlit/SiS</w:t>
+            </w:r>
+          </w:p>
+        </w:tc>
+        <w:tc>
+          <w:tcPr/>
+          <w:p>
+            <w:pPr>
+              <w:pStyle w:val="Compact"/>
+            </w:pPr>
+            <w:r>
+              <w:t xml:space="preserve">Bootstrap complexity, SPCS v2 migration, 4+ feature flags</w:t>
+            </w:r>
+          </w:p>
+        </w:tc>
+        <w:tc>
+          <w:tcPr/>
+          <w:p>
+            <w:pPr>
+              <w:pStyle w:val="Compact"/>
+            </w:pPr>
+            <w:r>
+              <w:t xml:space="preserve">40% of 2 eng (1,600 hours/year)</w:t>
+            </w:r>
+          </w:p>
+        </w:tc>
+        <w:tc>
+          <w:tcPr/>
+          <w:p>
+            <w:pPr>
+              <w:pStyle w:val="Compact"/>
+            </w:pPr>
+            <w:r>
+              <w:t xml:space="preserve">Slower app deployment, poor cold start UX</w:t>
+            </w:r>
+          </w:p>
+        </w:tc>
+      </w:tr>
+      <w:tr>
+        <w:tc>
+          <w:tcPr/>
+          <w:p>
+            <w:pPr>
+              <w:pStyle w:val="Compact"/>
+            </w:pPr>
+            <w:r>
+              <w:rPr>
+                <w:b/>
+                <w:bCs/>
+              </w:rPr>
+              <w:t xml:space="preserve">Cortex</w:t>
+            </w:r>
+          </w:p>
+        </w:tc>
+        <w:tc>
+          <w:tcPr/>
+          <w:p>
+            <w:pPr>
+              <w:pStyle w:val="Compact"/>
+            </w:pPr>
+            <w:r>
+              <w:t xml:space="preserve">Model deployment requires full SPCS config, image build overhead</w:t>
+            </w:r>
+          </w:p>
+        </w:tc>
+        <w:tc>
+          <w:tcPr/>
+          <w:p>
+            <w:pPr>
+              <w:pStyle w:val="Compact"/>
+            </w:pPr>
+            <w:r>
+              <w:t xml:space="preserve">40% of 2 eng (1,600 hours/year)</w:t>
+            </w:r>
+          </w:p>
+        </w:tc>
+        <w:tc>
+          <w:tcPr/>
+          <w:p>
+            <w:pPr>
+              <w:pStyle w:val="Compact"/>
+            </w:pPr>
+            <w:r>
+              <w:t xml:space="preserve">Delayed ML features, slow model updates</w:t>
+            </w:r>
+          </w:p>
+        </w:tc>
+      </w:tr>
+    </w:tbl>
     <w:p>
       <w:pPr>
         <w:pStyle w:val="BodyText"/>
       </w:pPr>
-      <w:r>
-        <w:t xml:space="preserve">Additionally,</w:t>
-      </w:r>
-      <w:r>
-        <w:t xml:space="preserve"> </w:t>
-      </w:r>
       <w:r>
         <w:rPr>
           <w:b/>
           <w:bCs/>
         </w:rPr>
-        <w:t xml:space="preserve">SPCS locks teams into the current container-based architecture</w:t>
-      </w:r>
-      <w:r>
-        <w:t xml:space="preserve">. There is no easy way to experiment with alternative execution models (microVMs, Firecracker, WebAssembly, etc.) without requiring every consumer team to rewrite their integration code. This architectural rigidity prevents the platform from evolving to adopt better technologies as they emerge.</w:t>
-      </w:r>
-    </w:p>
-    <w:bookmarkEnd w:id="26"/>
-    <w:bookmarkStart w:id="27" w:name="proposed-solution"/>
-    <w:p>
-      <w:pPr>
-        <w:pStyle w:val="Heading3"/>
-      </w:pPr>
-      <w:r>
-        <w:t xml:space="preserve">1.2 Proposed Solution</w:t>
-      </w:r>
-    </w:p>
-    <w:p>
-      <w:pPr>
-        <w:pStyle w:val="FirstParagraph"/>
-      </w:pPr>
-      <w:r>
-        <w:t xml:space="preserve">Build a</w:t>
+        <w:t xml:space="preserve">Combined Impact:</w:t>
+      </w:r>
+      <w:r>
+        <w:t xml:space="preserve"> </w:t>
+      </w:r>
+      <w:r>
+        <w:t xml:space="preserve">- 4,800 engineering hours/year spent on infrastructure =</w:t>
       </w:r>
       <w:r>
         <w:t xml:space="preserve"> </w:t>
@@ -1689,66 +2201,111 @@
           <w:b/>
           <w:bCs/>
         </w:rPr>
-        <w:t xml:space="preserve">Modal.ai-style serverless interface</w:t>
-      </w:r>
-      <w:r>
-        <w:t xml:space="preserve"> </w:t>
-      </w:r>
-      <w:r>
-        <w:t xml:space="preserve">that lets developers:</w:t>
-      </w:r>
-    </w:p>
-    <w:p>
-      <w:pPr>
-        <w:pStyle w:val="Compact"/>
+        <w:t xml:space="preserve">$720K-$1M lost productivity</w:t>
+      </w:r>
+      <w:r>
+        <w:t xml:space="preserve"> </w:t>
+      </w:r>
+      <w:r>
+        <w:t xml:space="preserve">- Feature velocity: 6 features/quarter instead of potential 10+</w:t>
+      </w:r>
+      <w:r>
+        <w:t xml:space="preserve"> </w:t>
+      </w:r>
+      <w:r>
+        <w:t xml:space="preserve">- Morale: Engineers frustrated managing infrastructure instead of building product</w:t>
+      </w:r>
+      <w:r>
+        <w:t xml:space="preserve"> </w:t>
+      </w:r>
+      <w:r>
+        <w:t xml:space="preserve">- Competitive disadvantage: AWS Lambda, Modal.ai ship features faster</w:t>
+      </w:r>
+    </w:p>
+    <w:bookmarkEnd w:id="29"/>
+    <w:bookmarkStart w:id="30" w:name="why-this-matters-now"/>
+    <w:p>
+      <w:pPr>
+        <w:pStyle w:val="Heading3"/>
+      </w:pPr>
+      <w:r>
+        <w:t xml:space="preserve">1.4 Why This Matters Now</w:t>
+      </w:r>
+    </w:p>
+    <w:p>
+      <w:pPr>
         <w:numPr>
           <w:ilvl w:val="0"/>
           <w:numId w:val="1008"/>
         </w:numPr>
       </w:pPr>
       <w:r>
-        <w:t xml:space="preserve">Write code in any language</w:t>
-      </w:r>
-    </w:p>
-    <w:p>
-      <w:pPr>
-        <w:pStyle w:val="Compact"/>
+        <w:rPr>
+          <w:b/>
+          <w:bCs/>
+        </w:rPr>
+        <w:t xml:space="preserve">Competitive Pressure</w:t>
+      </w:r>
+      <w:r>
+        <w:t xml:space="preserve">: AWS Lambda, Modal.ai, Google Cloud Run offer serverless compute that makes deployment trivial. Data teams are adopting these platforms for ML workloads.</w:t>
+      </w:r>
+    </w:p>
+    <w:p>
+      <w:pPr>
         <w:numPr>
           <w:ilvl w:val="0"/>
           <w:numId w:val="1008"/>
         </w:numPr>
       </w:pPr>
       <w:r>
-        <w:t xml:space="preserve">Decorate functions with resource requirements</w:t>
-      </w:r>
-    </w:p>
-    <w:p>
-      <w:pPr>
-        <w:pStyle w:val="Compact"/>
+        <w:rPr>
+          <w:b/>
+          <w:bCs/>
+        </w:rPr>
+        <w:t xml:space="preserve">Internal Inefficiency</w:t>
+      </w:r>
+      <w:r>
+        <w:t xml:space="preserve">: 40% of 6 engineers’ time = $1M/year wasted. This compounds as more teams need SPCS.</w:t>
+      </w:r>
+    </w:p>
+    <w:p>
+      <w:pPr>
         <w:numPr>
           <w:ilvl w:val="0"/>
           <w:numId w:val="1008"/>
         </w:numPr>
       </w:pPr>
       <w:r>
-        <w:t xml:space="preserve">Deploy instantly with a single command</w:t>
-      </w:r>
-    </w:p>
-    <w:p>
-      <w:pPr>
-        <w:pStyle w:val="Compact"/>
+        <w:rPr>
+          <w:b/>
+          <w:bCs/>
+        </w:rPr>
+        <w:t xml:space="preserve">Technology Readiness</w:t>
+      </w:r>
+      <w:r>
+        <w:t xml:space="preserve">: microVMs (Firecracker, gVisor) are production-ready and offer 10x better cold starts than containers. We can’t adopt them without breaking all existing integrations.</w:t>
+      </w:r>
+    </w:p>
+    <w:p>
+      <w:pPr>
         <w:numPr>
           <w:ilvl w:val="0"/>
           <w:numId w:val="1008"/>
         </w:numPr>
       </w:pPr>
       <w:r>
-        <w:t xml:space="preserve">Get endpoints automatically</w:t>
-      </w:r>
-    </w:p>
-    <w:p>
-      <w:pPr>
-        <w:pStyle w:val="Compact"/>
+        <w:rPr>
+          <w:b/>
+          <w:bCs/>
+        </w:rPr>
+        <w:t xml:space="preserve">Strategic Alignment</w:t>
+      </w:r>
+      <w:r>
+        <w:t xml:space="preserve">: Snowflake’s AI/ML strategy requires rapid feature iteration. Infrastructure complexity blocks this.</w:t>
+      </w:r>
+    </w:p>
+    <w:p>
+      <w:pPr>
         <w:numPr>
           <w:ilvl w:val="0"/>
           <w:numId w:val="1008"/>
@@ -1759,7 +2316,37 @@
           <w:b/>
           <w:bCs/>
         </w:rPr>
-        <w:t xml:space="preserve">Remain agnostic to the underlying execution model</w:t>
+        <w:t xml:space="preserve">Customer Demand</w:t>
+      </w:r>
+      <w:r>
+        <w:t xml:space="preserve">: When we expose this to customers (Native Apps, general availability), current complexity will be a major adoption barrier.</w:t>
+      </w:r>
+    </w:p>
+    <w:p>
+      <w:r>
+        <w:pict>
+          <v:rect style="width:0;height:1.5pt" o:hralign="center" o:hrstd="t" o:hr="t"/>
+        </w:pict>
+      </w:r>
+    </w:p>
+    <w:bookmarkEnd w:id="30"/>
+    <w:bookmarkEnd w:id="31"/>
+    <w:bookmarkStart w:id="35" w:name="current-state-analysis"/>
+    <w:p>
+      <w:pPr>
+        <w:pStyle w:val="Heading2"/>
+      </w:pPr>
+      <w:r>
+        <w:t xml:space="preserve">2. Current State Analysis</w:t>
+      </w:r>
+    </w:p>
+    <w:bookmarkStart w:id="32" w:name="how-teams-use-spcs-today"/>
+    <w:p>
+      <w:pPr>
+        <w:pStyle w:val="Heading3"/>
+      </w:pPr>
+      <w:r>
+        <w:t xml:space="preserve">2.1 How Teams Use SPCS Today</w:t>
       </w:r>
     </w:p>
     <w:p>
@@ -1767,24 +2354,722 @@
         <w:pStyle w:val="FirstParagraph"/>
       </w:pPr>
       <w:r>
-        <w:t xml:space="preserve">The platform handles all infrastructure behind the scenes. Critically,</w:t>
-      </w:r>
-      <w:r>
-        <w:t xml:space="preserve"> </w:t>
-      </w:r>
+        <w:t xml:space="preserve">Teams integrating with SPCS must manage 8+ infrastructure concerns:</w:t>
+      </w:r>
+    </w:p>
+    <w:p>
+      <w:pPr>
+        <w:pStyle w:val="SourceCode"/>
+      </w:pPr>
+      <w:r>
+        <w:rPr>
+          <w:rStyle w:val="VerbatimChar"/>
+        </w:rPr>
+        <w:t xml:space="preserve">┌─────────────────────────────────────────────────────────────────┐</w:t>
+      </w:r>
+      <w:r>
+        <w:br/>
+      </w:r>
+      <w:r>
+        <w:rPr>
+          <w:rStyle w:val="VerbatimChar"/>
+        </w:rPr>
+        <w:t xml:space="preserve">│              DEVELOPER RESPONSIBILITIES (Current)                │</w:t>
+      </w:r>
+      <w:r>
+        <w:br/>
+      </w:r>
+      <w:r>
+        <w:rPr>
+          <w:rStyle w:val="VerbatimChar"/>
+        </w:rPr>
+        <w:t xml:space="preserve">├─────────────────────────────────────────────────────────────────┤</w:t>
+      </w:r>
+      <w:r>
+        <w:br/>
+      </w:r>
+      <w:r>
+        <w:rPr>
+          <w:rStyle w:val="VerbatimChar"/>
+        </w:rPr>
+        <w:t xml:space="preserve">│  1. Compute Pool Management    CREATE COMPUTE POOL, sizing, DDL │</w:t>
+      </w:r>
+      <w:r>
+        <w:br/>
+      </w:r>
+      <w:r>
+        <w:rPr>
+          <w:rStyle w:val="VerbatimChar"/>
+        </w:rPr>
+        <w:t xml:space="preserve">│  2. Container Image Build      Dockerfile, build, push, version │</w:t>
+      </w:r>
+      <w:r>
+        <w:br/>
+      </w:r>
+      <w:r>
+        <w:rPr>
+          <w:rStyle w:val="VerbatimChar"/>
+        </w:rPr>
+        <w:t xml:space="preserve">│  3. ServiceSpec YAML (50+ lines)  containers, endpoints, volumes│</w:t>
+      </w:r>
+      <w:r>
+        <w:br/>
+      </w:r>
+      <w:r>
+        <w:rPr>
+          <w:rStyle w:val="VerbatimChar"/>
+        </w:rPr>
+        <w:t xml:space="preserve">│  4. Service Creation           CREATE SERVICE SQL statement     │</w:t>
+      </w:r>
+      <w:r>
+        <w:br/>
+      </w:r>
+      <w:r>
+        <w:rPr>
+          <w:rStyle w:val="VerbatimChar"/>
+        </w:rPr>
+        <w:t xml:space="preserve">│  5. Token Management           60-min OAuth refresh logic       │</w:t>
+      </w:r>
+      <w:r>
+        <w:br/>
+      </w:r>
+      <w:r>
+        <w:rPr>
+          <w:rStyle w:val="VerbatimChar"/>
+        </w:rPr>
+        <w:t xml:space="preserve">│  6. Endpoint Configuration     public/private, CORS, auth       │</w:t>
+      </w:r>
+      <w:r>
+        <w:br/>
+      </w:r>
+      <w:r>
+        <w:rPr>
+          <w:rStyle w:val="VerbatimChar"/>
+        </w:rPr>
+        <w:t xml:space="preserve">│  7. Scaling Configuration      min/max nodes, auto-suspend      │</w:t>
+      </w:r>
+      <w:r>
+        <w:br/>
+      </w:r>
+      <w:r>
+        <w:rPr>
+          <w:rStyle w:val="VerbatimChar"/>
+        </w:rPr>
+        <w:t xml:space="preserve">│  8. Monitoring &amp; Debugging     logs, metrics, health checks     │</w:t>
+      </w:r>
+      <w:r>
+        <w:br/>
+      </w:r>
+      <w:r>
+        <w:rPr>
+          <w:rStyle w:val="VerbatimChar"/>
+        </w:rPr>
+        <w:t xml:space="preserve">└─────────────────────────────────────────────────────────────────┘</w:t>
+      </w:r>
+    </w:p>
+    <w:p>
+      <w:pPr>
+        <w:pStyle w:val="FirstParagraph"/>
+      </w:pPr>
       <w:r>
         <w:rPr>
           <w:b/>
           <w:bCs/>
         </w:rPr>
+        <w:t xml:space="preserve">Example: Deploying a Simple Python Function (Current SPCS)</w:t>
+      </w:r>
+    </w:p>
+    <w:p>
+      <w:pPr>
+        <w:pStyle w:val="SourceCode"/>
+      </w:pPr>
+      <w:r>
+        <w:rPr>
+          <w:rStyle w:val="CommentTok"/>
+        </w:rPr>
+        <w:t xml:space="preserve"># Step 1: Create compute pool (separate DDL, must estimate sizing)</w:t>
+      </w:r>
+      <w:r>
+        <w:br/>
+      </w:r>
+      <w:r>
+        <w:rPr>
+          <w:rStyle w:val="CommentTok"/>
+        </w:rPr>
+        <w:t xml:space="preserve"># CREATE COMPUTE POOL my_pool</w:t>
+      </w:r>
+      <w:r>
+        <w:br/>
+      </w:r>
+      <w:r>
+        <w:rPr>
+          <w:rStyle w:val="CommentTok"/>
+        </w:rPr>
+        <w:t xml:space="preserve">#   INSTANCE_FAMILY = CPU_X64_S</w:t>
+      </w:r>
+      <w:r>
+        <w:br/>
+      </w:r>
+      <w:r>
+        <w:rPr>
+          <w:rStyle w:val="CommentTok"/>
+        </w:rPr>
+        <w:t xml:space="preserve">#   MIN_NODES = 1</w:t>
+      </w:r>
+      <w:r>
+        <w:br/>
+      </w:r>
+      <w:r>
+        <w:rPr>
+          <w:rStyle w:val="CommentTok"/>
+        </w:rPr>
+        <w:t xml:space="preserve">#   MAX_NODES = 5</w:t>
+      </w:r>
+      <w:r>
+        <w:br/>
+      </w:r>
+      <w:r>
+        <w:rPr>
+          <w:rStyle w:val="CommentTok"/>
+        </w:rPr>
+        <w:t xml:space="preserve">#   AUTO_SUSPEND_SECS = 300</w:t>
+      </w:r>
+      <w:r>
+        <w:br/>
+      </w:r>
+      <w:r>
+        <w:br/>
+      </w:r>
+      <w:r>
+        <w:rPr>
+          <w:rStyle w:val="CommentTok"/>
+        </w:rPr>
+        <w:t xml:space="preserve"># Step 2: Build and push container image (5-10 minutes)</w:t>
+      </w:r>
+      <w:r>
+        <w:br/>
+      </w:r>
+      <w:r>
+        <w:rPr>
+          <w:rStyle w:val="CommentTok"/>
+        </w:rPr>
+        <w:t xml:space="preserve"># docker build -t my-registry/my-function:v1 .</w:t>
+      </w:r>
+      <w:r>
+        <w:br/>
+      </w:r>
+      <w:r>
+        <w:rPr>
+          <w:rStyle w:val="CommentTok"/>
+        </w:rPr>
+        <w:t xml:space="preserve"># docker push my-registry/my-function:v1</w:t>
+      </w:r>
+      <w:r>
+        <w:br/>
+      </w:r>
+      <w:r>
+        <w:br/>
+      </w:r>
+      <w:r>
+        <w:rPr>
+          <w:rStyle w:val="CommentTok"/>
+        </w:rPr>
+        <w:t xml:space="preserve"># Step 3: Write ServiceSpec YAML (50+ lines)</w:t>
+      </w:r>
+      <w:r>
+        <w:br/>
+      </w:r>
+      <w:r>
+        <w:rPr>
+          <w:rStyle w:val="NormalTok"/>
+        </w:rPr>
+        <w:t xml:space="preserve">service_spec </w:t>
+      </w:r>
+      <w:r>
+        <w:rPr>
+          <w:rStyle w:val="OperatorTok"/>
+        </w:rPr>
+        <w:t xml:space="preserve">=</w:t>
+      </w:r>
+      <w:r>
+        <w:rPr>
+          <w:rStyle w:val="NormalTok"/>
+        </w:rPr>
+        <w:t xml:space="preserve"> </w:t>
+      </w:r>
+      <w:r>
+        <w:rPr>
+          <w:rStyle w:val="StringTok"/>
+        </w:rPr>
+        <w:t xml:space="preserve">"""</w:t>
+      </w:r>
+      <w:r>
+        <w:br/>
+      </w:r>
+      <w:r>
+        <w:rPr>
+          <w:rStyle w:val="StringTok"/>
+        </w:rPr>
+        <w:t xml:space="preserve">spec:</w:t>
+      </w:r>
+      <w:r>
+        <w:br/>
+      </w:r>
+      <w:r>
+        <w:rPr>
+          <w:rStyle w:val="StringTok"/>
+        </w:rPr>
+        <w:t xml:space="preserve">  containers:</w:t>
+      </w:r>
+      <w:r>
+        <w:br/>
+      </w:r>
+      <w:r>
+        <w:rPr>
+          <w:rStyle w:val="StringTok"/>
+        </w:rPr>
+        <w:t xml:space="preserve">  - name: main</w:t>
+      </w:r>
+      <w:r>
+        <w:br/>
+      </w:r>
+      <w:r>
+        <w:rPr>
+          <w:rStyle w:val="StringTok"/>
+        </w:rPr>
+        <w:t xml:space="preserve">    image: my-registry/my-function:v1</w:t>
+      </w:r>
+      <w:r>
+        <w:br/>
+      </w:r>
+      <w:r>
+        <w:rPr>
+          <w:rStyle w:val="StringTok"/>
+        </w:rPr>
+        <w:t xml:space="preserve">    env:</w:t>
+      </w:r>
+      <w:r>
+        <w:br/>
+      </w:r>
+      <w:r>
+        <w:rPr>
+          <w:rStyle w:val="StringTok"/>
+        </w:rPr>
+        <w:t xml:space="preserve">      KEY: value</w:t>
+      </w:r>
+      <w:r>
+        <w:br/>
+      </w:r>
+      <w:r>
+        <w:rPr>
+          <w:rStyle w:val="StringTok"/>
+        </w:rPr>
+        <w:t xml:space="preserve">    resources:</w:t>
+      </w:r>
+      <w:r>
+        <w:br/>
+      </w:r>
+      <w:r>
+        <w:rPr>
+          <w:rStyle w:val="StringTok"/>
+        </w:rPr>
+        <w:t xml:space="preserve">      requests:</w:t>
+      </w:r>
+      <w:r>
+        <w:br/>
+      </w:r>
+      <w:r>
+        <w:rPr>
+          <w:rStyle w:val="StringTok"/>
+        </w:rPr>
+        <w:t xml:space="preserve">        memory: 4Gi</w:t>
+      </w:r>
+      <w:r>
+        <w:br/>
+      </w:r>
+      <w:r>
+        <w:rPr>
+          <w:rStyle w:val="StringTok"/>
+        </w:rPr>
+        <w:t xml:space="preserve">        cpu: "2"</w:t>
+      </w:r>
+      <w:r>
+        <w:br/>
+      </w:r>
+      <w:r>
+        <w:rPr>
+          <w:rStyle w:val="StringTok"/>
+        </w:rPr>
+        <w:t xml:space="preserve">      limits:</w:t>
+      </w:r>
+      <w:r>
+        <w:br/>
+      </w:r>
+      <w:r>
+        <w:rPr>
+          <w:rStyle w:val="StringTok"/>
+        </w:rPr>
+        <w:t xml:space="preserve">        memory: 4Gi</w:t>
+      </w:r>
+      <w:r>
+        <w:br/>
+      </w:r>
+      <w:r>
+        <w:rPr>
+          <w:rStyle w:val="StringTok"/>
+        </w:rPr>
+        <w:t xml:space="preserve">        cpu: "2"</w:t>
+      </w:r>
+      <w:r>
+        <w:br/>
+      </w:r>
+      <w:r>
+        <w:rPr>
+          <w:rStyle w:val="StringTok"/>
+        </w:rPr>
+        <w:t xml:space="preserve">    readinessProbe:</w:t>
+      </w:r>
+      <w:r>
+        <w:br/>
+      </w:r>
+      <w:r>
+        <w:rPr>
+          <w:rStyle w:val="StringTok"/>
+        </w:rPr>
+        <w:t xml:space="preserve">      port: 8080</w:t>
+      </w:r>
+      <w:r>
+        <w:br/>
+      </w:r>
+      <w:r>
+        <w:rPr>
+          <w:rStyle w:val="StringTok"/>
+        </w:rPr>
+        <w:t xml:space="preserve">      path: /health</w:t>
+      </w:r>
+      <w:r>
+        <w:br/>
+      </w:r>
+      <w:r>
+        <w:rPr>
+          <w:rStyle w:val="StringTok"/>
+        </w:rPr>
+        <w:t xml:space="preserve">    volumeMounts:</w:t>
+      </w:r>
+      <w:r>
+        <w:br/>
+      </w:r>
+      <w:r>
+        <w:rPr>
+          <w:rStyle w:val="StringTok"/>
+        </w:rPr>
+        <w:t xml:space="preserve">    - name: data</w:t>
+      </w:r>
+      <w:r>
+        <w:br/>
+      </w:r>
+      <w:r>
+        <w:rPr>
+          <w:rStyle w:val="StringTok"/>
+        </w:rPr>
+        <w:t xml:space="preserve">      mountPath: /data</w:t>
+      </w:r>
+      <w:r>
+        <w:br/>
+      </w:r>
+      <w:r>
+        <w:rPr>
+          <w:rStyle w:val="StringTok"/>
+        </w:rPr>
+        <w:t xml:space="preserve">  endpoints:</w:t>
+      </w:r>
+      <w:r>
+        <w:br/>
+      </w:r>
+      <w:r>
+        <w:rPr>
+          <w:rStyle w:val="StringTok"/>
+        </w:rPr>
+        <w:t xml:space="preserve">  - name: api</w:t>
+      </w:r>
+      <w:r>
+        <w:br/>
+      </w:r>
+      <w:r>
+        <w:rPr>
+          <w:rStyle w:val="StringTok"/>
+        </w:rPr>
+        <w:t xml:space="preserve">    port: 8080</w:t>
+      </w:r>
+      <w:r>
+        <w:br/>
+      </w:r>
+      <w:r>
+        <w:rPr>
+          <w:rStyle w:val="StringTok"/>
+        </w:rPr>
+        <w:t xml:space="preserve">    public: true</w:t>
+      </w:r>
+      <w:r>
+        <w:br/>
+      </w:r>
+      <w:r>
+        <w:rPr>
+          <w:rStyle w:val="StringTok"/>
+        </w:rPr>
+        <w:t xml:space="preserve">  volumes:</w:t>
+      </w:r>
+      <w:r>
+        <w:br/>
+      </w:r>
+      <w:r>
+        <w:rPr>
+          <w:rStyle w:val="StringTok"/>
+        </w:rPr>
+        <w:t xml:space="preserve">  - name: data</w:t>
+      </w:r>
+      <w:r>
+        <w:br/>
+      </w:r>
+      <w:r>
+        <w:rPr>
+          <w:rStyle w:val="StringTok"/>
+        </w:rPr>
+        <w:t xml:space="preserve">    source: "@my_stage"</w:t>
+      </w:r>
+      <w:r>
+        <w:br/>
+      </w:r>
+      <w:r>
+        <w:rPr>
+          <w:rStyle w:val="StringTok"/>
+        </w:rPr>
+        <w:t xml:space="preserve">"""</w:t>
+      </w:r>
+      <w:r>
+        <w:br/>
+      </w:r>
+      <w:r>
+        <w:br/>
+      </w:r>
+      <w:r>
+        <w:rPr>
+          <w:rStyle w:val="CommentTok"/>
+        </w:rPr>
+        <w:t xml:space="preserve"># Step 4: Create service (SQL)</w:t>
+      </w:r>
+      <w:r>
+        <w:br/>
+      </w:r>
+      <w:r>
+        <w:rPr>
+          <w:rStyle w:val="CommentTok"/>
+        </w:rPr>
+        <w:t xml:space="preserve"># CREATE SERVICE my_service</w:t>
+      </w:r>
+      <w:r>
+        <w:br/>
+      </w:r>
+      <w:r>
+        <w:rPr>
+          <w:rStyle w:val="CommentTok"/>
+        </w:rPr>
+        <w:t xml:space="preserve">#   IN COMPUTE POOL my_pool</w:t>
+      </w:r>
+      <w:r>
+        <w:br/>
+      </w:r>
+      <w:r>
+        <w:rPr>
+          <w:rStyle w:val="CommentTok"/>
+        </w:rPr>
+        <w:t xml:space="preserve">#   FROM SPECIFICATION $$service_spec$$</w:t>
+      </w:r>
+      <w:r>
+        <w:br/>
+      </w:r>
+      <w:r>
+        <w:br/>
+      </w:r>
+      <w:r>
+        <w:rPr>
+          <w:rStyle w:val="CommentTok"/>
+        </w:rPr>
+        <w:t xml:space="preserve"># Step 5: Wait for ready, get endpoint (5+ minutes)</w:t>
+      </w:r>
+      <w:r>
+        <w:br/>
+      </w:r>
+      <w:r>
+        <w:rPr>
+          <w:rStyle w:val="CommentTok"/>
+        </w:rPr>
+        <w:t xml:space="preserve"># SELECT SYSTEM$GET_SERVICE_STATUS('my_service')</w:t>
+      </w:r>
+      <w:r>
+        <w:br/>
+      </w:r>
+      <w:r>
+        <w:rPr>
+          <w:rStyle w:val="CommentTok"/>
+        </w:rPr>
+        <w:t xml:space="preserve"># SHOW ENDPOINTS IN SERVICE my_service</w:t>
+      </w:r>
+      <w:r>
+        <w:br/>
+      </w:r>
+      <w:r>
+        <w:br/>
+      </w:r>
+      <w:r>
+        <w:rPr>
+          <w:rStyle w:val="CommentTok"/>
+        </w:rPr>
+        <w:t xml:space="preserve"># Step 6: Implement token refresh logic (60-min expiry)</w:t>
+      </w:r>
+      <w:r>
+        <w:br/>
+      </w:r>
+      <w:r>
+        <w:rPr>
+          <w:rStyle w:val="CommentTok"/>
+        </w:rPr>
+        <w:t xml:space="preserve"># ...additional code for session management...</w:t>
+      </w:r>
+      <w:r>
+        <w:br/>
+      </w:r>
+      <w:r>
+        <w:br/>
+      </w:r>
+      <w:r>
+        <w:rPr>
+          <w:rStyle w:val="CommentTok"/>
+        </w:rPr>
+        <w:t xml:space="preserve"># TOTAL: 30+ minutes, 50+ lines of code, 8 infrastructure concepts</w:t>
+      </w:r>
+    </w:p>
+    <w:bookmarkEnd w:id="32"/>
+    <w:bookmarkStart w:id="33" w:name="proposed-solution"/>
+    <w:p>
+      <w:pPr>
+        <w:pStyle w:val="Heading3"/>
+      </w:pPr>
+      <w:r>
+        <w:t xml:space="preserve">1.2 Proposed Solution</w:t>
+      </w:r>
+    </w:p>
+    <w:p>
+      <w:pPr>
+        <w:pStyle w:val="FirstParagraph"/>
+      </w:pPr>
+      <w:r>
+        <w:t xml:space="preserve">Build a</w:t>
+      </w:r>
+      <w:r>
+        <w:t xml:space="preserve"> </w:t>
+      </w:r>
+      <w:r>
+        <w:rPr>
+          <w:b/>
+          <w:bCs/>
+        </w:rPr>
+        <w:t xml:space="preserve">Modal.ai-style serverless interface</w:t>
+      </w:r>
+      <w:r>
+        <w:t xml:space="preserve"> </w:t>
+      </w:r>
+      <w:r>
+        <w:t xml:space="preserve">that lets developers:</w:t>
+      </w:r>
+    </w:p>
+    <w:p>
+      <w:pPr>
+        <w:pStyle w:val="Compact"/>
+        <w:numPr>
+          <w:ilvl w:val="0"/>
+          <w:numId w:val="1009"/>
+        </w:numPr>
+      </w:pPr>
+      <w:r>
+        <w:t xml:space="preserve">Write code in any language</w:t>
+      </w:r>
+    </w:p>
+    <w:p>
+      <w:pPr>
+        <w:pStyle w:val="Compact"/>
+        <w:numPr>
+          <w:ilvl w:val="0"/>
+          <w:numId w:val="1009"/>
+        </w:numPr>
+      </w:pPr>
+      <w:r>
+        <w:t xml:space="preserve">Decorate functions with resource requirements</w:t>
+      </w:r>
+    </w:p>
+    <w:p>
+      <w:pPr>
+        <w:pStyle w:val="Compact"/>
+        <w:numPr>
+          <w:ilvl w:val="0"/>
+          <w:numId w:val="1009"/>
+        </w:numPr>
+      </w:pPr>
+      <w:r>
+        <w:t xml:space="preserve">Deploy instantly with a single command</w:t>
+      </w:r>
+    </w:p>
+    <w:p>
+      <w:pPr>
+        <w:pStyle w:val="Compact"/>
+        <w:numPr>
+          <w:ilvl w:val="0"/>
+          <w:numId w:val="1009"/>
+        </w:numPr>
+      </w:pPr>
+      <w:r>
+        <w:t xml:space="preserve">Get endpoints automatically</w:t>
+      </w:r>
+    </w:p>
+    <w:p>
+      <w:pPr>
+        <w:pStyle w:val="Compact"/>
+        <w:numPr>
+          <w:ilvl w:val="0"/>
+          <w:numId w:val="1009"/>
+        </w:numPr>
+      </w:pPr>
+      <w:r>
+        <w:rPr>
+          <w:b/>
+          <w:bCs/>
+        </w:rPr>
+        <w:t xml:space="preserve">Remain agnostic to the underlying execution model</w:t>
+      </w:r>
+    </w:p>
+    <w:p>
+      <w:pPr>
+        <w:pStyle w:val="FirstParagraph"/>
+      </w:pPr>
+      <w:r>
+        <w:t xml:space="preserve">The platform handles all infrastructure behind the scenes. Critically,</w:t>
+      </w:r>
+      <w:r>
+        <w:t xml:space="preserve"> </w:t>
+      </w:r>
+      <w:r>
+        <w:rPr>
+          <w:b/>
+          <w:bCs/>
+        </w:rPr>
         <w:t xml:space="preserve">the unified interface decouples developer code from the execution backend</w:t>
       </w:r>
       <w:r>
         <w:t xml:space="preserve">, allowing Snowflake to experiment with and migrate between different compute architectures (containers on Kubernetes today, microVMs tomorrow, Firecracker, WebAssembly, etc.) without requiring any changes to consumer code.</w:t>
       </w:r>
     </w:p>
-    <w:bookmarkEnd w:id="27"/>
-    <w:bookmarkStart w:id="28" w:name="success-metrics"/>
+    <w:bookmarkEnd w:id="33"/>
+    <w:bookmarkStart w:id="34" w:name="success-metrics"/>
     <w:p>
       <w:pPr>
         <w:pStyle w:val="Heading3"/>
@@ -2026,9 +3311,9 @@
         </w:pict>
       </w:r>
     </w:p>
-    <w:bookmarkEnd w:id="28"/>
-    <w:bookmarkEnd w:id="29"/>
-    <w:bookmarkStart w:id="33" w:name="background-motivation"/>
+    <w:bookmarkEnd w:id="34"/>
+    <w:bookmarkEnd w:id="35"/>
+    <w:bookmarkStart w:id="39" w:name="background-motivation"/>
     <w:p>
       <w:pPr>
         <w:pStyle w:val="Heading2"/>
@@ -2037,7 +3322,7 @@
         <w:t xml:space="preserve">2. Background &amp; Motivation</w:t>
       </w:r>
     </w:p>
-    <w:bookmarkStart w:id="30" w:name="current-state"/>
+    <w:bookmarkStart w:id="36" w:name="current-state"/>
     <w:p>
       <w:pPr>
         <w:pStyle w:val="Heading3"/>
@@ -2164,8 +3449,8 @@
         <w:t xml:space="preserve">└─────────────────────────────────────────────────────────────┘</w:t>
       </w:r>
     </w:p>
-    <w:bookmarkEnd w:id="30"/>
-    <w:bookmarkStart w:id="31" w:name="pain-points-from-research"/>
+    <w:bookmarkEnd w:id="36"/>
+    <w:bookmarkStart w:id="37" w:name="pain-points-from-research"/>
     <w:p>
       <w:pPr>
         <w:pStyle w:val="Heading3"/>
@@ -2482,8 +3767,8 @@
         </w:tc>
       </w:tr>
     </w:tbl>
-    <w:bookmarkEnd w:id="31"/>
-    <w:bookmarkStart w:id="32" w:name="what-works-well"/>
+    <w:bookmarkEnd w:id="37"/>
+    <w:bookmarkStart w:id="38" w:name="what-works-well"/>
     <w:p>
       <w:pPr>
         <w:pStyle w:val="Heading3"/>
@@ -2651,9 +3936,9 @@
         </w:pict>
       </w:r>
     </w:p>
-    <w:bookmarkEnd w:id="32"/>
-    <w:bookmarkEnd w:id="33"/>
-    <w:bookmarkStart w:id="36" w:name="goals-non-goals"/>
+    <w:bookmarkEnd w:id="38"/>
+    <w:bookmarkEnd w:id="39"/>
+    <w:bookmarkStart w:id="42" w:name="goals-non-goals"/>
     <w:p>
       <w:pPr>
         <w:pStyle w:val="Heading2"/>
@@ -2662,7 +3947,7 @@
         <w:t xml:space="preserve">3. Goals &amp; Non-Goals</w:t>
       </w:r>
     </w:p>
-    <w:bookmarkStart w:id="34" w:name="goals"/>
+    <w:bookmarkStart w:id="40" w:name="goals"/>
     <w:p>
       <w:pPr>
         <w:pStyle w:val="Heading3"/>
@@ -2906,8 +4191,8 @@
         </w:tc>
       </w:tr>
     </w:tbl>
-    <w:bookmarkEnd w:id="34"/>
-    <w:bookmarkStart w:id="35" w:name="non-goals-v1"/>
+    <w:bookmarkEnd w:id="40"/>
+    <w:bookmarkStart w:id="41" w:name="non-goals-v1"/>
     <w:p>
       <w:pPr>
         <w:pStyle w:val="Heading3"/>
@@ -3058,9 +4343,9 @@
         </w:pict>
       </w:r>
     </w:p>
-    <w:bookmarkEnd w:id="35"/>
-    <w:bookmarkEnd w:id="36"/>
-    <w:bookmarkStart w:id="39" w:name="user-personas"/>
+    <w:bookmarkEnd w:id="41"/>
+    <w:bookmarkEnd w:id="42"/>
+    <w:bookmarkStart w:id="45" w:name="user-personas"/>
     <w:p>
       <w:pPr>
         <w:pStyle w:val="Heading2"/>
@@ -3069,7 +4354,7 @@
         <w:t xml:space="preserve">4. User Personas</w:t>
       </w:r>
     </w:p>
-    <w:bookmarkStart w:id="37" w:name="primary-internal-platform-teams"/>
+    <w:bookmarkStart w:id="43" w:name="primary-internal-platform-teams"/>
     <w:p>
       <w:pPr>
         <w:pStyle w:val="Heading3"/>
@@ -3150,8 +4435,8 @@
         <w:t xml:space="preserve">- Pain: GPU provisioning, resource estimation, image management</w:t>
       </w:r>
     </w:p>
-    <w:bookmarkEnd w:id="37"/>
-    <w:bookmarkStart w:id="38" w:name="secondary-snowflake-customers-future"/>
+    <w:bookmarkEnd w:id="43"/>
+    <w:bookmarkStart w:id="44" w:name="secondary-snowflake-customers-future"/>
     <w:p>
       <w:pPr>
         <w:pStyle w:val="Heading3"/>
@@ -3165,7 +4450,7 @@
         <w:pStyle w:val="Compact"/>
         <w:numPr>
           <w:ilvl w:val="0"/>
-          <w:numId w:val="1009"/>
+          <w:numId w:val="1010"/>
         </w:numPr>
       </w:pPr>
       <w:r>
@@ -3177,7 +4462,7 @@
         <w:pStyle w:val="Compact"/>
         <w:numPr>
           <w:ilvl w:val="0"/>
-          <w:numId w:val="1009"/>
+          <w:numId w:val="1010"/>
         </w:numPr>
       </w:pPr>
       <w:r>
@@ -3189,7 +4474,7 @@
         <w:pStyle w:val="Compact"/>
         <w:numPr>
           <w:ilvl w:val="0"/>
-          <w:numId w:val="1009"/>
+          <w:numId w:val="1010"/>
         </w:numPr>
       </w:pPr>
       <w:r>
@@ -3203,9 +4488,9 @@
         </w:pict>
       </w:r>
     </w:p>
-    <w:bookmarkEnd w:id="38"/>
-    <w:bookmarkEnd w:id="39"/>
-    <w:bookmarkStart w:id="51" w:name="proposed-solution-1"/>
+    <w:bookmarkEnd w:id="44"/>
+    <w:bookmarkEnd w:id="45"/>
+    <w:bookmarkStart w:id="57" w:name="proposed-solution-1"/>
     <w:p>
       <w:pPr>
         <w:pStyle w:val="Heading2"/>
@@ -3214,7 +4499,7 @@
         <w:t xml:space="preserve">5. Proposed Solution</w:t>
       </w:r>
     </w:p>
-    <w:bookmarkStart w:id="40" w:name="core-concept"/>
+    <w:bookmarkStart w:id="46" w:name="core-concept"/>
     <w:p>
       <w:pPr>
         <w:pStyle w:val="Heading3"/>
@@ -3450,8 +4735,8 @@
         <w:t xml:space="preserve">└─────────────────────────────────────────────────────────────┘</w:t>
       </w:r>
     </w:p>
-    <w:bookmarkEnd w:id="40"/>
-    <w:bookmarkStart w:id="45" w:name="api-design"/>
+    <w:bookmarkEnd w:id="46"/>
+    <w:bookmarkStart w:id="51" w:name="api-design"/>
     <w:p>
       <w:pPr>
         <w:pStyle w:val="Heading3"/>
@@ -3460,7 +4745,7 @@
         <w:t xml:space="preserve">5.2 API Design</w:t>
       </w:r>
     </w:p>
-    <w:bookmarkStart w:id="41" w:name="core-decorators"/>
+    <w:bookmarkStart w:id="47" w:name="core-decorators"/>
     <w:p>
       <w:pPr>
         <w:pStyle w:val="Heading4"/>
@@ -4365,8 +5650,8 @@
         <w:t xml:space="preserve"># ...</w:t>
       </w:r>
     </w:p>
-    <w:bookmarkEnd w:id="41"/>
-    <w:bookmarkStart w:id="42" w:name="Xdd0074942c74358f90139d411d624468da71e63"/>
+    <w:bookmarkEnd w:id="47"/>
+    <w:bookmarkStart w:id="48" w:name="Xdd0074942c74358f90139d411d624468da71e63"/>
     <w:p>
       <w:pPr>
         <w:pStyle w:val="Heading4"/>
@@ -5081,8 +6366,8 @@
         </w:tc>
       </w:tr>
     </w:tbl>
-    <w:bookmarkEnd w:id="42"/>
-    <w:bookmarkStart w:id="43" w:name="deployment-methods"/>
+    <w:bookmarkEnd w:id="48"/>
+    <w:bookmarkStart w:id="49" w:name="deployment-methods"/>
     <w:p>
       <w:pPr>
         <w:pStyle w:val="Heading4"/>
@@ -5447,8 +6732,8 @@
         <w:t xml:space="preserve">)</w:t>
       </w:r>
     </w:p>
-    <w:bookmarkEnd w:id="43"/>
-    <w:bookmarkStart w:id="44" w:name="endpoint-operations"/>
+    <w:bookmarkEnd w:id="49"/>
+    <w:bookmarkStart w:id="50" w:name="endpoint-operations"/>
     <w:p>
       <w:pPr>
         <w:pStyle w:val="Heading4"/>
@@ -5783,9 +7068,9 @@
         <w:t xml:space="preserve"># Invocations, latency, errors, cost</w:t>
       </w:r>
     </w:p>
-    <w:bookmarkEnd w:id="44"/>
-    <w:bookmarkEnd w:id="45"/>
-    <w:bookmarkStart w:id="46" w:name="snowflake-integration"/>
+    <w:bookmarkEnd w:id="50"/>
+    <w:bookmarkEnd w:id="51"/>
+    <w:bookmarkStart w:id="52" w:name="snowflake-integration"/>
     <w:p>
       <w:pPr>
         <w:pStyle w:val="Heading3"/>
@@ -6078,8 +7363,8 @@
         <w:t xml:space="preserve"> call_openai(api_key)</w:t>
       </w:r>
     </w:p>
-    <w:bookmarkEnd w:id="46"/>
-    <w:bookmarkStart w:id="50" w:name="multi-language-support"/>
+    <w:bookmarkEnd w:id="52"/>
+    <w:bookmarkStart w:id="56" w:name="multi-language-support"/>
     <w:p>
       <w:pPr>
         <w:pStyle w:val="Heading3"/>
@@ -6088,7 +7373,7 @@
         <w:t xml:space="preserve">5.4 Multi-Language Support</w:t>
       </w:r>
     </w:p>
-    <w:bookmarkStart w:id="47" w:name="python-native---zero-config"/>
+    <w:bookmarkStart w:id="53" w:name="python-native---zero-config"/>
     <w:p>
       <w:pPr>
         <w:pStyle w:val="Heading4"/>
@@ -6201,8 +7486,8 @@
         <w:t xml:space="preserve"> pd.DataFrame(data).to_dict()</w:t>
       </w:r>
     </w:p>
-    <w:bookmarkEnd w:id="47"/>
-    <w:bookmarkStart w:id="48" w:name="container-any-language"/>
+    <w:bookmarkEnd w:id="53"/>
+    <w:bookmarkStart w:id="54" w:name="container-any-language"/>
     <w:p>
       <w:pPr>
         <w:pStyle w:val="Heading4"/>
@@ -6378,8 +7663,8 @@
         <w:t xml:space="preserve">)</w:t>
       </w:r>
     </w:p>
-    <w:bookmarkEnd w:id="48"/>
-    <w:bookmarkStart w:id="49" w:name="dockerfile-build-from-source"/>
+    <w:bookmarkEnd w:id="54"/>
+    <w:bookmarkStart w:id="55" w:name="dockerfile-build-from-source"/>
     <w:p>
       <w:pPr>
         <w:pStyle w:val="Heading4"/>
@@ -6502,10 +7787,10 @@
         </w:pict>
       </w:r>
     </w:p>
-    <w:bookmarkEnd w:id="49"/>
-    <w:bookmarkEnd w:id="50"/>
-    <w:bookmarkEnd w:id="51"/>
-    <w:bookmarkStart w:id="62" w:name="technical-architecture"/>
+    <w:bookmarkEnd w:id="55"/>
+    <w:bookmarkEnd w:id="56"/>
+    <w:bookmarkEnd w:id="57"/>
+    <w:bookmarkStart w:id="68" w:name="technical-architecture"/>
     <w:p>
       <w:pPr>
         <w:pStyle w:val="Heading2"/>
@@ -6514,7 +7799,7 @@
         <w:t xml:space="preserve">6. Technical Architecture</w:t>
       </w:r>
     </w:p>
-    <w:bookmarkStart w:id="52" w:name="system-components"/>
+    <w:bookmarkStart w:id="58" w:name="system-components"/>
     <w:p>
       <w:pPr>
         <w:pStyle w:val="Heading3"/>
@@ -6741,8 +8026,8 @@
         <w:t xml:space="preserve">└─────────────────────────────────────────────────────────────┘</w:t>
       </w:r>
     </w:p>
-    <w:bookmarkEnd w:id="52"/>
-    <w:bookmarkStart w:id="53" w:name="deployment-flow"/>
+    <w:bookmarkEnd w:id="58"/>
+    <w:bookmarkStart w:id="59" w:name="deployment-flow"/>
     <w:p>
       <w:pPr>
         <w:pStyle w:val="Heading3"/>
@@ -7185,8 +8470,8 @@
         <w:t xml:space="preserve">   • Monitoring automatically enabled</w:t>
       </w:r>
     </w:p>
-    <w:bookmarkEnd w:id="53"/>
-    <w:bookmarkStart w:id="54" w:name="warm-pool-fleet"/>
+    <w:bookmarkEnd w:id="59"/>
+    <w:bookmarkStart w:id="60" w:name="warm-pool-fleet"/>
     <w:p>
       <w:pPr>
         <w:pStyle w:val="Heading3"/>
@@ -7397,8 +8682,8 @@
         <w:t xml:space="preserve">• Always maintain minimum idle capacity per tier</w:t>
       </w:r>
     </w:p>
-    <w:bookmarkEnd w:id="54"/>
-    <w:bookmarkStart w:id="55" w:name="token-management"/>
+    <w:bookmarkEnd w:id="60"/>
+    <w:bookmarkStart w:id="61" w:name="token-management"/>
     <w:p>
       <w:pPr>
         <w:pStyle w:val="Heading3"/>
@@ -7921,8 +9206,8 @@
         <w:t xml:space="preserve">            f.write(new_token)</w:t>
       </w:r>
     </w:p>
-    <w:bookmarkEnd w:id="55"/>
-    <w:bookmarkStart w:id="61" w:name="execution-backend-abstraction-layer"/>
+    <w:bookmarkEnd w:id="61"/>
+    <w:bookmarkStart w:id="67" w:name="execution-backend-abstraction-layer"/>
     <w:p>
       <w:pPr>
         <w:pStyle w:val="Heading3"/>
@@ -8338,7 +9623,7 @@
         <w:t xml:space="preserve">└─────────────────────────────────────────────────────────────────┘</w:t>
       </w:r>
     </w:p>
-    <w:bookmarkStart w:id="56" w:name="backend-selection-criteria"/>
+    <w:bookmarkStart w:id="62" w:name="backend-selection-criteria"/>
     <w:p>
       <w:pPr>
         <w:pStyle w:val="Heading4"/>
@@ -8668,8 +9953,8 @@
         </w:tc>
       </w:tr>
     </w:tbl>
-    <w:bookmarkEnd w:id="56"/>
-    <w:bookmarkStart w:id="57" w:name="migration-example-spcs-to-microvms"/>
+    <w:bookmarkEnd w:id="62"/>
+    <w:bookmarkStart w:id="63" w:name="migration-example-spcs-to-microvms"/>
     <w:p>
       <w:pPr>
         <w:pStyle w:val="Heading4"/>
@@ -8847,8 +10132,8 @@
         <w:t xml:space="preserve">Timeline: 2-4 weeks, low risk</w:t>
       </w:r>
     </w:p>
-    <w:bookmarkEnd w:id="57"/>
-    <w:bookmarkStart w:id="58" w:name="implementation-strategy"/>
+    <w:bookmarkEnd w:id="63"/>
+    <w:bookmarkStart w:id="64" w:name="implementation-strategy"/>
     <w:p>
       <w:pPr>
         <w:pStyle w:val="Heading4"/>
@@ -10023,8 +11308,8 @@
         <w:t xml:space="preserve"># Default</w:t>
       </w:r>
     </w:p>
-    <w:bookmarkEnd w:id="58"/>
-    <w:bookmarkStart w:id="59" w:name="benefits-of-backend-abstraction"/>
+    <w:bookmarkEnd w:id="64"/>
+    <w:bookmarkStart w:id="65" w:name="benefits-of-backend-abstraction"/>
     <w:p>
       <w:pPr>
         <w:pStyle w:val="Heading4"/>
@@ -10279,8 +11564,8 @@
         </w:tc>
       </w:tr>
     </w:tbl>
-    <w:bookmarkEnd w:id="59"/>
-    <w:bookmarkStart w:id="60" w:name="real-world-example-notebooks-migration"/>
+    <w:bookmarkEnd w:id="65"/>
+    <w:bookmarkStart w:id="66" w:name="real-world-example-notebooks-migration"/>
     <w:p>
       <w:pPr>
         <w:pStyle w:val="Heading4"/>
@@ -10517,10 +11802,10 @@
         </w:pict>
       </w:r>
     </w:p>
-    <w:bookmarkEnd w:id="60"/>
-    <w:bookmarkEnd w:id="61"/>
-    <w:bookmarkEnd w:id="62"/>
-    <w:bookmarkStart w:id="76" w:name="detailed-requirements"/>
+    <w:bookmarkEnd w:id="66"/>
+    <w:bookmarkEnd w:id="67"/>
+    <w:bookmarkEnd w:id="68"/>
+    <w:bookmarkStart w:id="82" w:name="detailed-requirements"/>
     <w:p>
       <w:pPr>
         <w:pStyle w:val="Heading2"/>
@@ -10529,7 +11814,7 @@
         <w:t xml:space="preserve">7. Detailed Requirements</w:t>
       </w:r>
     </w:p>
-    <w:bookmarkStart w:id="70" w:name="functional-requirements"/>
+    <w:bookmarkStart w:id="76" w:name="functional-requirements"/>
     <w:p>
       <w:pPr>
         <w:pStyle w:val="Heading3"/>
@@ -10538,7 +11823,7 @@
         <w:t xml:space="preserve">7.1 Functional Requirements</w:t>
       </w:r>
     </w:p>
-    <w:bookmarkStart w:id="63" w:name="fr1-function-deployment"/>
+    <w:bookmarkStart w:id="69" w:name="fr1-function-deployment"/>
     <w:p>
       <w:pPr>
         <w:pStyle w:val="Heading4"/>
@@ -10857,8 +12142,8 @@
         </w:tc>
       </w:tr>
     </w:tbl>
-    <w:bookmarkEnd w:id="63"/>
-    <w:bookmarkStart w:id="64" w:name="fr2-app-deployment-streamlit"/>
+    <w:bookmarkEnd w:id="69"/>
+    <w:bookmarkStart w:id="70" w:name="fr2-app-deployment-streamlit"/>
     <w:p>
       <w:pPr>
         <w:pStyle w:val="Heading4"/>
@@ -11072,8 +12357,8 @@
         </w:tc>
       </w:tr>
     </w:tbl>
-    <w:bookmarkEnd w:id="64"/>
-    <w:bookmarkStart w:id="65" w:name="fr3-notebook-deployment"/>
+    <w:bookmarkEnd w:id="70"/>
+    <w:bookmarkStart w:id="71" w:name="fr3-notebook-deployment"/>
     <w:p>
       <w:pPr>
         <w:pStyle w:val="Heading4"/>
@@ -11281,8 +12566,8 @@
         </w:tc>
       </w:tr>
     </w:tbl>
-    <w:bookmarkEnd w:id="65"/>
-    <w:bookmarkStart w:id="66" w:name="fr4-job-deployment"/>
+    <w:bookmarkEnd w:id="71"/>
+    <w:bookmarkStart w:id="72" w:name="fr4-job-deployment"/>
     <w:p>
       <w:pPr>
         <w:pStyle w:val="Heading4"/>
@@ -11496,8 +12781,8 @@
         </w:tc>
       </w:tr>
     </w:tbl>
-    <w:bookmarkEnd w:id="66"/>
-    <w:bookmarkStart w:id="67" w:name="fr5-container-deployment"/>
+    <w:bookmarkEnd w:id="72"/>
+    <w:bookmarkStart w:id="73" w:name="fr5-container-deployment"/>
     <w:p>
       <w:pPr>
         <w:pStyle w:val="Heading4"/>
@@ -11670,8 +12955,8 @@
         </w:tc>
       </w:tr>
     </w:tbl>
-    <w:bookmarkEnd w:id="67"/>
-    <w:bookmarkStart w:id="68" w:name="fr6-endpoint-management"/>
+    <w:bookmarkEnd w:id="73"/>
+    <w:bookmarkStart w:id="74" w:name="fr6-endpoint-management"/>
     <w:p>
       <w:pPr>
         <w:pStyle w:val="Heading4"/>
@@ -11940,8 +13225,8 @@
         </w:tc>
       </w:tr>
     </w:tbl>
-    <w:bookmarkEnd w:id="68"/>
-    <w:bookmarkStart w:id="69" w:name="fr7-snowflake-integration"/>
+    <w:bookmarkEnd w:id="74"/>
+    <w:bookmarkStart w:id="75" w:name="fr7-snowflake-integration"/>
     <w:p>
       <w:pPr>
         <w:pStyle w:val="Heading4"/>
@@ -12140,9 +13425,9 @@
         </w:tc>
       </w:tr>
     </w:tbl>
-    <w:bookmarkEnd w:id="69"/>
-    <w:bookmarkEnd w:id="70"/>
-    <w:bookmarkStart w:id="75" w:name="non-functional-requirements"/>
+    <w:bookmarkEnd w:id="75"/>
+    <w:bookmarkEnd w:id="76"/>
+    <w:bookmarkStart w:id="81" w:name="non-functional-requirements"/>
     <w:p>
       <w:pPr>
         <w:pStyle w:val="Heading3"/>
@@ -12151,7 +13436,7 @@
         <w:t xml:space="preserve">7.2 Non-Functional Requirements</w:t>
       </w:r>
     </w:p>
-    <w:bookmarkStart w:id="71" w:name="nfr1-performance"/>
+    <w:bookmarkStart w:id="77" w:name="nfr1-performance"/>
     <w:p>
       <w:pPr>
         <w:pStyle w:val="Heading4"/>
@@ -12385,8 +13670,8 @@
         </w:tc>
       </w:tr>
     </w:tbl>
-    <w:bookmarkEnd w:id="71"/>
-    <w:bookmarkStart w:id="72" w:name="nfr2-reliability"/>
+    <w:bookmarkEnd w:id="77"/>
+    <w:bookmarkStart w:id="78" w:name="nfr2-reliability"/>
     <w:p>
       <w:pPr>
         <w:pStyle w:val="Heading4"/>
@@ -12550,8 +13835,8 @@
         </w:tc>
       </w:tr>
     </w:tbl>
-    <w:bookmarkEnd w:id="72"/>
-    <w:bookmarkStart w:id="73" w:name="nfr3-scalability"/>
+    <w:bookmarkEnd w:id="78"/>
+    <w:bookmarkStart w:id="79" w:name="nfr3-scalability"/>
     <w:p>
       <w:pPr>
         <w:pStyle w:val="Heading4"/>
@@ -12715,8 +14000,8 @@
         </w:tc>
       </w:tr>
     </w:tbl>
-    <w:bookmarkEnd w:id="73"/>
-    <w:bookmarkStart w:id="74" w:name="nfr4-security"/>
+    <w:bookmarkEnd w:id="79"/>
+    <w:bookmarkStart w:id="80" w:name="nfr4-security"/>
     <w:p>
       <w:pPr>
         <w:pStyle w:val="Heading4"/>
@@ -12922,10 +14207,10 @@
         </w:pict>
       </w:r>
     </w:p>
-    <w:bookmarkEnd w:id="74"/>
-    <w:bookmarkEnd w:id="75"/>
-    <w:bookmarkEnd w:id="76"/>
-    <w:bookmarkStart w:id="81" w:name="user-stories"/>
+    <w:bookmarkEnd w:id="80"/>
+    <w:bookmarkEnd w:id="81"/>
+    <w:bookmarkEnd w:id="82"/>
+    <w:bookmarkStart w:id="87" w:name="user-stories"/>
     <w:p>
       <w:pPr>
         <w:pStyle w:val="Heading2"/>
@@ -12934,7 +14219,7 @@
         <w:t xml:space="preserve">8. User Stories</w:t>
       </w:r>
     </w:p>
-    <w:bookmarkStart w:id="77" w:name="notebooks-team"/>
+    <w:bookmarkStart w:id="83" w:name="notebooks-team"/>
     <w:p>
       <w:pPr>
         <w:pStyle w:val="Heading3"/>
@@ -13032,8 +14317,8 @@
         <w:t xml:space="preserve">- Snowflake session works automatically</w:t>
       </w:r>
     </w:p>
-    <w:bookmarkEnd w:id="77"/>
-    <w:bookmarkStart w:id="78" w:name="streamlit-team"/>
+    <w:bookmarkEnd w:id="83"/>
+    <w:bookmarkStart w:id="84" w:name="streamlit-team"/>
     <w:p>
       <w:pPr>
         <w:pStyle w:val="Heading3"/>
@@ -13131,8 +14416,8 @@
         <w:t xml:space="preserve">- Token refresh is automatic (no session timeouts)</w:t>
       </w:r>
     </w:p>
-    <w:bookmarkEnd w:id="78"/>
-    <w:bookmarkStart w:id="79" w:name="cortex-team"/>
+    <w:bookmarkEnd w:id="84"/>
+    <w:bookmarkStart w:id="85" w:name="cortex-team"/>
     <w:p>
       <w:pPr>
         <w:pStyle w:val="Heading3"/>
@@ -13230,8 +14515,8 @@
         <w:t xml:space="preserve">- Cost tracked per invocation</w:t>
       </w:r>
     </w:p>
-    <w:bookmarkEnd w:id="79"/>
-    <w:bookmarkStart w:id="80" w:name="general"/>
+    <w:bookmarkEnd w:id="85"/>
+    <w:bookmarkStart w:id="86" w:name="general"/>
     <w:p>
       <w:pPr>
         <w:pStyle w:val="Heading3"/>
@@ -13327,9 +14612,9 @@
         </w:pict>
       </w:r>
     </w:p>
-    <w:bookmarkEnd w:id="80"/>
-    <w:bookmarkEnd w:id="81"/>
-    <w:bookmarkStart w:id="87" w:name="rollout-plan"/>
+    <w:bookmarkEnd w:id="86"/>
+    <w:bookmarkEnd w:id="87"/>
+    <w:bookmarkStart w:id="93" w:name="rollout-plan"/>
     <w:p>
       <w:pPr>
         <w:pStyle w:val="Heading2"/>
@@ -13338,7 +14623,7 @@
         <w:t xml:space="preserve">9. Rollout Plan</w:t>
       </w:r>
     </w:p>
-    <w:bookmarkStart w:id="82" w:name="phase-1-internal-alpha-month-1-2"/>
+    <w:bookmarkStart w:id="88" w:name="phase-1-internal-alpha-month-1-2"/>
     <w:p>
       <w:pPr>
         <w:pStyle w:val="Heading3"/>
@@ -13452,8 +14737,8 @@
         <w:t xml:space="preserve">- No major bugs</w:t>
       </w:r>
     </w:p>
-    <w:bookmarkEnd w:id="82"/>
-    <w:bookmarkStart w:id="83" w:name="phase-2-internal-beta-month-3-4"/>
+    <w:bookmarkEnd w:id="88"/>
+    <w:bookmarkStart w:id="89" w:name="phase-2-internal-beta-month-3-4"/>
     <w:p>
       <w:pPr>
         <w:pStyle w:val="Heading3"/>
@@ -13594,8 +14879,8 @@
         <w:t xml:space="preserve">- P0 features working reliably</w:t>
       </w:r>
     </w:p>
-    <w:bookmarkEnd w:id="83"/>
-    <w:bookmarkStart w:id="84" w:name="phase-3-internal-ga-month-5-6"/>
+    <w:bookmarkEnd w:id="89"/>
+    <w:bookmarkStart w:id="90" w:name="phase-3-internal-ga-month-5-6"/>
     <w:p>
       <w:pPr>
         <w:pStyle w:val="Heading3"/>
@@ -13718,8 +15003,8 @@
         <w:t xml:space="preserve">- 90% developer satisfaction</w:t>
       </w:r>
     </w:p>
-    <w:bookmarkEnd w:id="84"/>
-    <w:bookmarkStart w:id="85" w:name="phase-4-customer-preview-month-7"/>
+    <w:bookmarkEnd w:id="90"/>
+    <w:bookmarkStart w:id="91" w:name="phase-4-customer-preview-month-7"/>
     <w:p>
       <w:pPr>
         <w:pStyle w:val="Heading3"/>
@@ -13782,8 +15067,8 @@
         <w:t xml:space="preserve">- Select customer beta</w:t>
       </w:r>
     </w:p>
-    <w:bookmarkEnd w:id="85"/>
-    <w:bookmarkStart w:id="86" w:name="Xc74aee396203f166dc5aa98ccb4d630a47f6ad3"/>
+    <w:bookmarkEnd w:id="91"/>
+    <w:bookmarkStart w:id="92" w:name="Xc74aee396203f166dc5aa98ccb4d630a47f6ad3"/>
     <w:p>
       <w:pPr>
         <w:pStyle w:val="Heading3"/>
@@ -13925,9 +15210,9 @@
         </w:pict>
       </w:r>
     </w:p>
-    <w:bookmarkEnd w:id="86"/>
-    <w:bookmarkEnd w:id="87"/>
-    <w:bookmarkStart w:id="101" w:name="open-questions-options"/>
+    <w:bookmarkEnd w:id="92"/>
+    <w:bookmarkEnd w:id="93"/>
+    <w:bookmarkStart w:id="107" w:name="open-questions-options"/>
     <w:p>
       <w:pPr>
         <w:pStyle w:val="Heading2"/>
@@ -13936,7 +15221,7 @@
         <w:t xml:space="preserve">10. Open Questions &amp; Options</w:t>
       </w:r>
     </w:p>
-    <w:bookmarkStart w:id="88" w:name="X886600f3419f1ba661dae2b3974d89d7c9eb290"/>
+    <w:bookmarkStart w:id="94" w:name="X886600f3419f1ba661dae2b3974d89d7c9eb290"/>
     <w:p>
       <w:pPr>
         <w:pStyle w:val="Heading3"/>
@@ -14337,8 +15622,8 @@
         </w:pict>
       </w:r>
     </w:p>
-    <w:bookmarkEnd w:id="88"/>
-    <w:bookmarkStart w:id="89" w:name="Xdc27fa91fbe88972fea24f8f964924113381d9f"/>
+    <w:bookmarkEnd w:id="94"/>
+    <w:bookmarkStart w:id="95" w:name="Xdc27fa91fbe88972fea24f8f964924113381d9f"/>
     <w:p>
       <w:pPr>
         <w:pStyle w:val="Heading3"/>
@@ -14687,8 +15972,8 @@
         </w:pict>
       </w:r>
     </w:p>
-    <w:bookmarkEnd w:id="89"/>
-    <w:bookmarkStart w:id="90" w:name="q3-whats-the-billing-model"/>
+    <w:bookmarkEnd w:id="95"/>
+    <w:bookmarkStart w:id="96" w:name="q3-whats-the-billing-model"/>
     <w:p>
       <w:pPr>
         <w:pStyle w:val="Heading3"/>
@@ -15328,8 +16613,8 @@
         </w:pict>
       </w:r>
     </w:p>
-    <w:bookmarkEnd w:id="90"/>
-    <w:bookmarkStart w:id="91" w:name="X74a893634041aa35bf5b0385aba9b54ec39d493"/>
+    <w:bookmarkEnd w:id="96"/>
+    <w:bookmarkStart w:id="97" w:name="X74a893634041aa35bf5b0385aba9b54ec39d493"/>
     <w:p>
       <w:pPr>
         <w:pStyle w:val="Heading3"/>
@@ -15755,8 +17040,8 @@
         </w:pict>
       </w:r>
     </w:p>
-    <w:bookmarkEnd w:id="91"/>
-    <w:bookmarkStart w:id="92" w:name="X228b6fcc422cb61b1d25ac24cd496387649f03f"/>
+    <w:bookmarkEnd w:id="97"/>
+    <w:bookmarkStart w:id="98" w:name="X228b6fcc422cb61b1d25ac24cd496387649f03f"/>
     <w:p>
       <w:pPr>
         <w:pStyle w:val="Heading3"/>
@@ -16323,8 +17608,8 @@
         </w:pict>
       </w:r>
     </w:p>
-    <w:bookmarkEnd w:id="92"/>
-    <w:bookmarkStart w:id="93" w:name="Xdf98ff99bcf2bc35ae4df09e32d1154dcc67306"/>
+    <w:bookmarkEnd w:id="98"/>
+    <w:bookmarkStart w:id="99" w:name="Xdf98ff99bcf2bc35ae4df09e32d1154dcc67306"/>
     <w:p>
       <w:pPr>
         <w:pStyle w:val="Heading3"/>
@@ -16833,7 +18118,7 @@
         <w:pStyle w:val="Compact"/>
         <w:numPr>
           <w:ilvl w:val="0"/>
-          <w:numId w:val="1010"/>
+          <w:numId w:val="1011"/>
         </w:numPr>
       </w:pPr>
       <w:r>
@@ -16848,76 +18133,6 @@
       </w:r>
       <w:r>
         <w:t xml:space="preserve">for custom dependencies:</w:t>
-      </w:r>
-    </w:p>
-    <w:p>
-      <w:pPr>
-        <w:pStyle w:val="Compact"/>
-        <w:numPr>
-          <w:ilvl w:val="1"/>
-          <w:numId w:val="1011"/>
-        </w:numPr>
-      </w:pPr>
-      <w:r>
-        <w:t xml:space="preserve">Parse</w:t>
-      </w:r>
-      <w:r>
-        <w:t xml:space="preserve"> </w:t>
-      </w:r>
-      <w:r>
-        <w:rPr>
-          <w:rStyle w:val="VerbatimChar"/>
-        </w:rPr>
-        <w:t xml:space="preserve">requirements.txt</w:t>
-      </w:r>
-      <w:r>
-        <w:t xml:space="preserve"> </w:t>
-      </w:r>
-      <w:r>
-        <w:t xml:space="preserve">or detect imports</w:t>
-      </w:r>
-    </w:p>
-    <w:p>
-      <w:pPr>
-        <w:pStyle w:val="Compact"/>
-        <w:numPr>
-          <w:ilvl w:val="1"/>
-          <w:numId w:val="1011"/>
-        </w:numPr>
-      </w:pPr>
-      <w:r>
-        <w:t xml:space="preserve">Cache dependency layers (90%+ hit rate for common libraries)</w:t>
-      </w:r>
-    </w:p>
-    <w:p>
-      <w:pPr>
-        <w:pStyle w:val="Compact"/>
-        <w:numPr>
-          <w:ilvl w:val="1"/>
-          <w:numId w:val="1011"/>
-        </w:numPr>
-      </w:pPr>
-      <w:r>
-        <w:t xml:space="preserve">Only rebuild app code layer (fast incremental builds)</w:t>
-      </w:r>
-    </w:p>
-    <w:p>
-      <w:pPr>
-        <w:pStyle w:val="Compact"/>
-        <w:numPr>
-          <w:ilvl w:val="0"/>
-          <w:numId w:val="1010"/>
-        </w:numPr>
-      </w:pPr>
-      <w:r>
-        <w:rPr>
-          <w:b/>
-          <w:bCs/>
-        </w:rPr>
-        <w:t xml:space="preserve">Automatic selection</w:t>
-      </w:r>
-      <w:r>
-        <w:t xml:space="preserve">:</w:t>
       </w:r>
     </w:p>
     <w:p>
@@ -16929,7 +18144,7 @@
         </w:numPr>
       </w:pPr>
       <w:r>
-        <w:t xml:space="preserve">If function imports</w:t>
+        <w:t xml:space="preserve">Parse</w:t>
       </w:r>
       <w:r>
         <w:t xml:space="preserve"> </w:t>
@@ -16938,28 +18153,13 @@
         <w:rPr>
           <w:rStyle w:val="VerbatimChar"/>
         </w:rPr>
-        <w:t xml:space="preserve">torch</w:t>
-      </w:r>
-      <w:r>
-        <w:t xml:space="preserve"> </w:t>
-      </w:r>
-      <w:r>
-        <w:t xml:space="preserve">→ use</w:t>
-      </w:r>
-      <w:r>
-        <w:t xml:space="preserve"> </w:t>
-      </w:r>
-      <w:r>
-        <w:rPr>
-          <w:rStyle w:val="VerbatimChar"/>
-        </w:rPr>
-        <w:t xml:space="preserve">python3.11-ml</w:t>
-      </w:r>
-      <w:r>
-        <w:t xml:space="preserve"> </w:t>
-      </w:r>
-      <w:r>
-        <w:t xml:space="preserve">base</w:t>
+        <w:t xml:space="preserve">requirements.txt</w:t>
+      </w:r>
+      <w:r>
+        <w:t xml:space="preserve"> </w:t>
+      </w:r>
+      <w:r>
+        <w:t xml:space="preserve">or detect imports</w:t>
       </w:r>
     </w:p>
     <w:p>
@@ -16971,22 +18171,7 @@
         </w:numPr>
       </w:pPr>
       <w:r>
-        <w:t xml:space="preserve">If function has</w:t>
-      </w:r>
-      <w:r>
-        <w:t xml:space="preserve"> </w:t>
-      </w:r>
-      <w:r>
-        <w:rPr>
-          <w:rStyle w:val="VerbatimChar"/>
-        </w:rPr>
-        <w:t xml:space="preserve">requirements.txt</w:t>
-      </w:r>
-      <w:r>
-        <w:t xml:space="preserve"> </w:t>
-      </w:r>
-      <w:r>
-        <w:t xml:space="preserve">→ install on top of nearest base</w:t>
+        <w:t xml:space="preserve">Cache dependency layers (90%+ hit rate for common libraries)</w:t>
       </w:r>
     </w:p>
     <w:p>
@@ -16998,6 +18183,106 @@
         </w:numPr>
       </w:pPr>
       <w:r>
+        <w:t xml:space="preserve">Only rebuild app code layer (fast incremental builds)</w:t>
+      </w:r>
+    </w:p>
+    <w:p>
+      <w:pPr>
+        <w:pStyle w:val="Compact"/>
+        <w:numPr>
+          <w:ilvl w:val="0"/>
+          <w:numId w:val="1011"/>
+        </w:numPr>
+      </w:pPr>
+      <w:r>
+        <w:rPr>
+          <w:b/>
+          <w:bCs/>
+        </w:rPr>
+        <w:t xml:space="preserve">Automatic selection</w:t>
+      </w:r>
+      <w:r>
+        <w:t xml:space="preserve">:</w:t>
+      </w:r>
+    </w:p>
+    <w:p>
+      <w:pPr>
+        <w:pStyle w:val="Compact"/>
+        <w:numPr>
+          <w:ilvl w:val="1"/>
+          <w:numId w:val="1013"/>
+        </w:numPr>
+      </w:pPr>
+      <w:r>
+        <w:t xml:space="preserve">If function imports</w:t>
+      </w:r>
+      <w:r>
+        <w:t xml:space="preserve"> </w:t>
+      </w:r>
+      <w:r>
+        <w:rPr>
+          <w:rStyle w:val="VerbatimChar"/>
+        </w:rPr>
+        <w:t xml:space="preserve">torch</w:t>
+      </w:r>
+      <w:r>
+        <w:t xml:space="preserve"> </w:t>
+      </w:r>
+      <w:r>
+        <w:t xml:space="preserve">→ use</w:t>
+      </w:r>
+      <w:r>
+        <w:t xml:space="preserve"> </w:t>
+      </w:r>
+      <w:r>
+        <w:rPr>
+          <w:rStyle w:val="VerbatimChar"/>
+        </w:rPr>
+        <w:t xml:space="preserve">python3.11-ml</w:t>
+      </w:r>
+      <w:r>
+        <w:t xml:space="preserve"> </w:t>
+      </w:r>
+      <w:r>
+        <w:t xml:space="preserve">base</w:t>
+      </w:r>
+    </w:p>
+    <w:p>
+      <w:pPr>
+        <w:pStyle w:val="Compact"/>
+        <w:numPr>
+          <w:ilvl w:val="1"/>
+          <w:numId w:val="1013"/>
+        </w:numPr>
+      </w:pPr>
+      <w:r>
+        <w:t xml:space="preserve">If function has</w:t>
+      </w:r>
+      <w:r>
+        <w:t xml:space="preserve"> </w:t>
+      </w:r>
+      <w:r>
+        <w:rPr>
+          <w:rStyle w:val="VerbatimChar"/>
+        </w:rPr>
+        <w:t xml:space="preserve">requirements.txt</w:t>
+      </w:r>
+      <w:r>
+        <w:t xml:space="preserve"> </w:t>
+      </w:r>
+      <w:r>
+        <w:t xml:space="preserve">→ install on top of nearest base</w:t>
+      </w:r>
+    </w:p>
+    <w:p>
+      <w:pPr>
+        <w:pStyle w:val="Compact"/>
+        <w:numPr>
+          <w:ilvl w:val="1"/>
+          <w:numId w:val="1013"/>
+        </w:numPr>
+      </w:pPr>
+      <w:r>
         <w:t xml:space="preserve">If custom Dockerfile provided → full build (power users)</w:t>
       </w:r>
     </w:p>
@@ -17056,8 +18341,8 @@
         </w:pict>
       </w:r>
     </w:p>
-    <w:bookmarkEnd w:id="93"/>
-    <w:bookmarkStart w:id="94" w:name="X56bc26ea010b641c3435449300c8865548aa960"/>
+    <w:bookmarkEnd w:id="99"/>
+    <w:bookmarkStart w:id="100" w:name="X56bc26ea010b641c3435449300c8865548aa960"/>
     <w:p>
       <w:pPr>
         <w:pStyle w:val="Heading3"/>
@@ -17556,7 +18841,7 @@
       <w:pPr>
         <w:numPr>
           <w:ilvl w:val="0"/>
-          <w:numId w:val="1013"/>
+          <w:numId w:val="1014"/>
         </w:numPr>
       </w:pPr>
       <w:r>
@@ -17577,7 +18862,7 @@
       <w:pPr>
         <w:numPr>
           <w:ilvl w:val="0"/>
-          <w:numId w:val="1013"/>
+          <w:numId w:val="1014"/>
         </w:numPr>
       </w:pPr>
       <w:r>
@@ -17586,60 +18871,6 @@
           <w:bCs/>
         </w:rPr>
         <w:t xml:space="preserve">Migration support program</w:t>
-      </w:r>
-      <w:r>
-        <w:t xml:space="preserve">:</w:t>
-      </w:r>
-    </w:p>
-    <w:p>
-      <w:pPr>
-        <w:pStyle w:val="Compact"/>
-        <w:numPr>
-          <w:ilvl w:val="1"/>
-          <w:numId w:val="1014"/>
-        </w:numPr>
-      </w:pPr>
-      <w:r>
-        <w:t xml:space="preserve">Month 5-6: PM + 2 eng dedicated to helping teams migrate</w:t>
-      </w:r>
-    </w:p>
-    <w:p>
-      <w:pPr>
-        <w:pStyle w:val="Compact"/>
-        <w:numPr>
-          <w:ilvl w:val="1"/>
-          <w:numId w:val="1014"/>
-        </w:numPr>
-      </w:pPr>
-      <w:r>
-        <w:t xml:space="preserve">Office hours, pair programming, code reviews</w:t>
-      </w:r>
-    </w:p>
-    <w:p>
-      <w:pPr>
-        <w:pStyle w:val="Compact"/>
-        <w:numPr>
-          <w:ilvl w:val="1"/>
-          <w:numId w:val="1014"/>
-        </w:numPr>
-      </w:pPr>
-      <w:r>
-        <w:t xml:space="preserve">Track migration bottlenecks, improve tooling</w:t>
-      </w:r>
-    </w:p>
-    <w:p>
-      <w:pPr>
-        <w:numPr>
-          <w:ilvl w:val="0"/>
-          <w:numId w:val="1013"/>
-        </w:numPr>
-      </w:pPr>
-      <w:r>
-        <w:rPr>
-          <w:b/>
-          <w:bCs/>
-        </w:rPr>
-        <w:t xml:space="preserve">Backward compatibility</w:t>
       </w:r>
       <w:r>
         <w:t xml:space="preserve">:</w:t>
@@ -17654,7 +18885,7 @@
         </w:numPr>
       </w:pPr>
       <w:r>
-        <w:t xml:space="preserve">SPCS stays supported indefinitely (no forced migration)</w:t>
+        <w:t xml:space="preserve">Month 5-6: PM + 2 eng dedicated to helping teams migrate</w:t>
       </w:r>
     </w:p>
     <w:p>
@@ -17666,7 +18897,7 @@
         </w:numPr>
       </w:pPr>
       <w:r>
-        <w:t xml:space="preserve">Hybrid mode: ServiceSpec + serverless functions in same account</w:t>
+        <w:t xml:space="preserve">Office hours, pair programming, code reviews</w:t>
       </w:r>
     </w:p>
     <w:p>
@@ -17678,6 +18909,60 @@
         </w:numPr>
       </w:pPr>
       <w:r>
+        <w:t xml:space="preserve">Track migration bottlenecks, improve tooling</w:t>
+      </w:r>
+    </w:p>
+    <w:p>
+      <w:pPr>
+        <w:numPr>
+          <w:ilvl w:val="0"/>
+          <w:numId w:val="1014"/>
+        </w:numPr>
+      </w:pPr>
+      <w:r>
+        <w:rPr>
+          <w:b/>
+          <w:bCs/>
+        </w:rPr>
+        <w:t xml:space="preserve">Backward compatibility</w:t>
+      </w:r>
+      <w:r>
+        <w:t xml:space="preserve">:</w:t>
+      </w:r>
+    </w:p>
+    <w:p>
+      <w:pPr>
+        <w:pStyle w:val="Compact"/>
+        <w:numPr>
+          <w:ilvl w:val="1"/>
+          <w:numId w:val="1016"/>
+        </w:numPr>
+      </w:pPr>
+      <w:r>
+        <w:t xml:space="preserve">SPCS stays supported indefinitely (no forced migration)</w:t>
+      </w:r>
+    </w:p>
+    <w:p>
+      <w:pPr>
+        <w:pStyle w:val="Compact"/>
+        <w:numPr>
+          <w:ilvl w:val="1"/>
+          <w:numId w:val="1016"/>
+        </w:numPr>
+      </w:pPr>
+      <w:r>
+        <w:t xml:space="preserve">Hybrid mode: ServiceSpec + serverless functions in same account</w:t>
+      </w:r>
+    </w:p>
+    <w:p>
+      <w:pPr>
+        <w:pStyle w:val="Compact"/>
+        <w:numPr>
+          <w:ilvl w:val="1"/>
+          <w:numId w:val="1016"/>
+        </w:numPr>
+      </w:pPr>
+      <w:r>
         <w:t xml:space="preserve">Teams migrate at their own pace</w:t>
       </w:r>
     </w:p>
@@ -17906,8 +19191,8 @@
         </w:pict>
       </w:r>
     </w:p>
-    <w:bookmarkEnd w:id="94"/>
-    <w:bookmarkStart w:id="95" w:name="X373b03c7e71776b9946446fc3027a30914caab8"/>
+    <w:bookmarkEnd w:id="100"/>
+    <w:bookmarkStart w:id="101" w:name="X373b03c7e71776b9946446fc3027a30914caab8"/>
     <w:p>
       <w:pPr>
         <w:pStyle w:val="Heading3"/>
@@ -18365,7 +19650,7 @@
         <w:pStyle w:val="Compact"/>
         <w:numPr>
           <w:ilvl w:val="0"/>
-          <w:numId w:val="1016"/>
+          <w:numId w:val="1017"/>
         </w:numPr>
       </w:pPr>
       <w:r>
@@ -18377,61 +19662,6 @@
       </w:r>
       <w:r>
         <w:t xml:space="preserve">: Native App developers (Preview)</w:t>
-      </w:r>
-    </w:p>
-    <w:p>
-      <w:pPr>
-        <w:pStyle w:val="Compact"/>
-        <w:numPr>
-          <w:ilvl w:val="1"/>
-          <w:numId w:val="1017"/>
-        </w:numPr>
-      </w:pPr>
-      <w:r>
-        <w:t xml:space="preserve">Native Apps are already containerized, understand SPCS</w:t>
-      </w:r>
-    </w:p>
-    <w:p>
-      <w:pPr>
-        <w:pStyle w:val="Compact"/>
-        <w:numPr>
-          <w:ilvl w:val="1"/>
-          <w:numId w:val="1017"/>
-        </w:numPr>
-      </w:pPr>
-      <w:r>
-        <w:t xml:space="preserve">Build example apps showcasing serverless (faster dev, lower cost)</w:t>
-      </w:r>
-    </w:p>
-    <w:p>
-      <w:pPr>
-        <w:pStyle w:val="Compact"/>
-        <w:numPr>
-          <w:ilvl w:val="1"/>
-          <w:numId w:val="1017"/>
-        </w:numPr>
-      </w:pPr>
-      <w:r>
-        <w:t xml:space="preserve">Feedback loop: 50 early adopter app devs</w:t>
-      </w:r>
-    </w:p>
-    <w:p>
-      <w:pPr>
-        <w:pStyle w:val="Compact"/>
-        <w:numPr>
-          <w:ilvl w:val="0"/>
-          <w:numId w:val="1016"/>
-        </w:numPr>
-      </w:pPr>
-      <w:r>
-        <w:rPr>
-          <w:b/>
-          <w:bCs/>
-        </w:rPr>
-        <w:t xml:space="preserve">Phase 3 (Month 10-12)</w:t>
-      </w:r>
-      <w:r>
-        <w:t xml:space="preserve">: All customers (Public Beta)</w:t>
       </w:r>
     </w:p>
     <w:p>
@@ -18443,7 +19673,7 @@
         </w:numPr>
       </w:pPr>
       <w:r>
-        <w:t xml:space="preserve">Full documentation, Snowsight UI integration</w:t>
+        <w:t xml:space="preserve">Native Apps are already containerized, understand SPCS</w:t>
       </w:r>
     </w:p>
     <w:p>
@@ -18455,7 +19685,7 @@
         </w:numPr>
       </w:pPr>
       <w:r>
-        <w:t xml:space="preserve">Free tier (1M compute-seconds/month) to drive adoption</w:t>
+        <w:t xml:space="preserve">Build example apps showcasing serverless (faster dev, lower cost)</w:t>
       </w:r>
     </w:p>
     <w:p>
@@ -18467,6 +19697,61 @@
         </w:numPr>
       </w:pPr>
       <w:r>
+        <w:t xml:space="preserve">Feedback loop: 50 early adopter app devs</w:t>
+      </w:r>
+    </w:p>
+    <w:p>
+      <w:pPr>
+        <w:pStyle w:val="Compact"/>
+        <w:numPr>
+          <w:ilvl w:val="0"/>
+          <w:numId w:val="1017"/>
+        </w:numPr>
+      </w:pPr>
+      <w:r>
+        <w:rPr>
+          <w:b/>
+          <w:bCs/>
+        </w:rPr>
+        <w:t xml:space="preserve">Phase 3 (Month 10-12)</w:t>
+      </w:r>
+      <w:r>
+        <w:t xml:space="preserve">: All customers (Public Beta)</w:t>
+      </w:r>
+    </w:p>
+    <w:p>
+      <w:pPr>
+        <w:pStyle w:val="Compact"/>
+        <w:numPr>
+          <w:ilvl w:val="1"/>
+          <w:numId w:val="1019"/>
+        </w:numPr>
+      </w:pPr>
+      <w:r>
+        <w:t xml:space="preserve">Full documentation, Snowsight UI integration</w:t>
+      </w:r>
+    </w:p>
+    <w:p>
+      <w:pPr>
+        <w:pStyle w:val="Compact"/>
+        <w:numPr>
+          <w:ilvl w:val="1"/>
+          <w:numId w:val="1019"/>
+        </w:numPr>
+      </w:pPr>
+      <w:r>
+        <w:t xml:space="preserve">Free tier (1M compute-seconds/month) to drive adoption</w:t>
+      </w:r>
+    </w:p>
+    <w:p>
+      <w:pPr>
+        <w:pStyle w:val="Compact"/>
+        <w:numPr>
+          <w:ilvl w:val="1"/>
+          <w:numId w:val="1019"/>
+        </w:numPr>
+      </w:pPr>
+      <w:r>
         <w:t xml:space="preserve">Target: 1000 customer accounts by Month 12</w:t>
       </w:r>
     </w:p>
@@ -18543,8 +19828,8 @@
         </w:pict>
       </w:r>
     </w:p>
-    <w:bookmarkEnd w:id="95"/>
-    <w:bookmarkStart w:id="96" w:name="Xcb69117b2b5ed8eaa7cbd0b1aaba944fa6aaca0"/>
+    <w:bookmarkEnd w:id="101"/>
+    <w:bookmarkStart w:id="102" w:name="Xcb69117b2b5ed8eaa7cbd0b1aaba944fa6aaca0"/>
     <w:p>
       <w:pPr>
         <w:pStyle w:val="Heading3"/>
@@ -19344,8 +20629,8 @@
         </w:pict>
       </w:r>
     </w:p>
-    <w:bookmarkEnd w:id="96"/>
-    <w:bookmarkStart w:id="97" w:name="q10-how-should-auto-scaling-work"/>
+    <w:bookmarkEnd w:id="102"/>
+    <w:bookmarkStart w:id="103" w:name="q10-how-should-auto-scaling-work"/>
     <w:p>
       <w:pPr>
         <w:pStyle w:val="Heading3"/>
@@ -20091,7 +21376,7 @@
       <w:pPr>
         <w:numPr>
           <w:ilvl w:val="0"/>
-          <w:numId w:val="1019"/>
+          <w:numId w:val="1020"/>
         </w:numPr>
       </w:pPr>
       <w:r>
@@ -20325,7 +21610,7 @@
       <w:pPr>
         <w:numPr>
           <w:ilvl w:val="0"/>
-          <w:numId w:val="1019"/>
+          <w:numId w:val="1020"/>
         </w:numPr>
       </w:pPr>
       <w:r>
@@ -20561,8 +21846,8 @@
         </w:pict>
       </w:r>
     </w:p>
-    <w:bookmarkEnd w:id="97"/>
-    <w:bookmarkStart w:id="98" w:name="X8164f77a0bb6acc19340a6fabb955f1b44a8978"/>
+    <w:bookmarkEnd w:id="103"/>
+    <w:bookmarkStart w:id="104" w:name="X8164f77a0bb6acc19340a6fabb955f1b44a8978"/>
     <w:p>
       <w:pPr>
         <w:pStyle w:val="Heading3"/>
@@ -21340,7 +22625,7 @@
         <w:pStyle w:val="Compact"/>
         <w:numPr>
           <w:ilvl w:val="0"/>
-          <w:numId w:val="1020"/>
+          <w:numId w:val="1021"/>
         </w:numPr>
       </w:pPr>
       <w:r>
@@ -21362,7 +22647,7 @@
         <w:pStyle w:val="Compact"/>
         <w:numPr>
           <w:ilvl w:val="1"/>
-          <w:numId w:val="1021"/>
+          <w:numId w:val="1022"/>
         </w:numPr>
       </w:pPr>
       <w:r>
@@ -21374,7 +22659,7 @@
         <w:pStyle w:val="Compact"/>
         <w:numPr>
           <w:ilvl w:val="1"/>
-          <w:numId w:val="1021"/>
+          <w:numId w:val="1022"/>
         </w:numPr>
       </w:pPr>
       <w:r>
@@ -21386,7 +22671,7 @@
         <w:pStyle w:val="Compact"/>
         <w:numPr>
           <w:ilvl w:val="1"/>
-          <w:numId w:val="1021"/>
+          <w:numId w:val="1022"/>
         </w:numPr>
       </w:pPr>
       <w:r>
@@ -21816,8 +23101,8 @@
         </w:pict>
       </w:r>
     </w:p>
-    <w:bookmarkEnd w:id="98"/>
-    <w:bookmarkStart w:id="99" w:name="Xe833545b883e695bf864cbd660bf10dcd5d444b"/>
+    <w:bookmarkEnd w:id="104"/>
+    <w:bookmarkStart w:id="105" w:name="Xe833545b883e695bf864cbd660bf10dcd5d444b"/>
     <w:p>
       <w:pPr>
         <w:pStyle w:val="Heading3"/>
@@ -23436,8 +24721,8 @@
         </w:pict>
       </w:r>
     </w:p>
-    <w:bookmarkEnd w:id="99"/>
-    <w:bookmarkStart w:id="100" w:name="X61907ae050d472d9cc4a3e81d17613bbc228df1"/>
+    <w:bookmarkEnd w:id="105"/>
+    <w:bookmarkStart w:id="106" w:name="X61907ae050d472d9cc4a3e81d17613bbc228df1"/>
     <w:p>
       <w:pPr>
         <w:pStyle w:val="Heading3"/>
@@ -25335,9 +26620,9 @@
         </w:pict>
       </w:r>
     </w:p>
-    <w:bookmarkEnd w:id="100"/>
-    <w:bookmarkEnd w:id="101"/>
-    <w:bookmarkStart w:id="107" w:name="team-resources"/>
+    <w:bookmarkEnd w:id="106"/>
+    <w:bookmarkEnd w:id="107"/>
+    <w:bookmarkStart w:id="113" w:name="team-resources"/>
     <w:p>
       <w:pPr>
         <w:pStyle w:val="Heading2"/>
@@ -25346,7 +26631,7 @@
         <w:t xml:space="preserve">12. Team &amp; Resources</w:t>
       </w:r>
     </w:p>
-    <w:bookmarkStart w:id="102" w:name="core-team-composition"/>
+    <w:bookmarkStart w:id="108" w:name="core-team-composition"/>
     <w:p>
       <w:pPr>
         <w:pStyle w:val="Heading3"/>
@@ -25823,8 +27108,8 @@
         </w:tc>
       </w:tr>
     </w:tbl>
-    <w:bookmarkEnd w:id="102"/>
-    <w:bookmarkStart w:id="103" w:name="supporting-teams-not-in-core-budget"/>
+    <w:bookmarkEnd w:id="108"/>
+    <w:bookmarkStart w:id="109" w:name="supporting-teams-not-in-core-budget"/>
     <w:p>
       <w:pPr>
         <w:pStyle w:val="Heading3"/>
@@ -26157,8 +27442,8 @@
         </w:tc>
       </w:tr>
     </w:tbl>
-    <w:bookmarkEnd w:id="103"/>
-    <w:bookmarkStart w:id="104" w:name="infrastructure-costs"/>
+    <w:bookmarkEnd w:id="109"/>
+    <w:bookmarkStart w:id="110" w:name="infrastructure-costs"/>
     <w:p>
       <w:pPr>
         <w:pStyle w:val="Heading3"/>
@@ -26535,8 +27820,8 @@
         </w:tc>
       </w:tr>
     </w:tbl>
-    <w:bookmarkEnd w:id="104"/>
-    <w:bookmarkStart w:id="105" w:name="total-investment-year-1"/>
+    <w:bookmarkEnd w:id="110"/>
+    <w:bookmarkStart w:id="111" w:name="total-investment-year-1"/>
     <w:p>
       <w:pPr>
         <w:pStyle w:val="Heading3"/>
@@ -26675,8 +27960,8 @@
         <w:t xml:space="preserve">Note: Supporting team costs absorbed by existing budgets. Estimated at ~$300K opportunity cost.</w:t>
       </w:r>
     </w:p>
-    <w:bookmarkEnd w:id="105"/>
-    <w:bookmarkStart w:id="106" w:name="ongoing-costs-year-2"/>
+    <w:bookmarkEnd w:id="111"/>
+    <w:bookmarkStart w:id="112" w:name="ongoing-costs-year-2"/>
     <w:p>
       <w:pPr>
         <w:pStyle w:val="Heading3"/>
@@ -26888,9 +28173,9 @@
         </w:pict>
       </w:r>
     </w:p>
-    <w:bookmarkEnd w:id="106"/>
-    <w:bookmarkEnd w:id="107"/>
-    <w:bookmarkStart w:id="113" w:name="financial-analysis-roi"/>
+    <w:bookmarkEnd w:id="112"/>
+    <w:bookmarkEnd w:id="113"/>
+    <w:bookmarkStart w:id="119" w:name="financial-analysis-roi"/>
     <w:p>
       <w:pPr>
         <w:pStyle w:val="Heading2"/>
@@ -26899,7 +28184,7 @@
         <w:t xml:space="preserve">13. Financial Analysis &amp; ROI</w:t>
       </w:r>
     </w:p>
-    <w:bookmarkStart w:id="108" w:name="cost-savings-internal-efficiency"/>
+    <w:bookmarkStart w:id="114" w:name="cost-savings-internal-efficiency"/>
     <w:p>
       <w:pPr>
         <w:pStyle w:val="Heading3"/>
@@ -27080,8 +28365,8 @@
         <w:t xml:space="preserve">Annual Savings: $630K-$900K</w:t>
       </w:r>
     </w:p>
-    <w:bookmarkEnd w:id="108"/>
-    <w:bookmarkStart w:id="109" w:name="revenue-impact-feature-velocity"/>
+    <w:bookmarkEnd w:id="114"/>
+    <w:bookmarkStart w:id="115" w:name="revenue-impact-feature-velocity"/>
     <w:p>
       <w:pPr>
         <w:pStyle w:val="Heading3"/>
@@ -27222,8 +28507,8 @@
         <w:t xml:space="preserve">- Year 3: +$4M ARR</w:t>
       </w:r>
     </w:p>
-    <w:bookmarkEnd w:id="109"/>
-    <w:bookmarkStart w:id="110" w:name="customer-value-future-revenue"/>
+    <w:bookmarkEnd w:id="115"/>
+    <w:bookmarkStart w:id="116" w:name="customer-value-future-revenue"/>
     <w:p>
       <w:pPr>
         <w:pStyle w:val="Heading3"/>
@@ -27320,8 +28605,8 @@
         <w:t xml:space="preserve">Total Customer Revenue (Years 2-4): $8.5M</w:t>
       </w:r>
     </w:p>
-    <w:bookmarkEnd w:id="110"/>
-    <w:bookmarkStart w:id="111" w:name="roi-calculation"/>
+    <w:bookmarkEnd w:id="116"/>
+    <w:bookmarkStart w:id="117" w:name="roi-calculation"/>
     <w:p>
       <w:pPr>
         <w:pStyle w:val="Heading3"/>
@@ -27693,8 +28978,8 @@
         <w:t xml:space="preserve">(3-year cumulative benefits / 3-year cumulative investment)</w:t>
       </w:r>
     </w:p>
-    <w:bookmarkEnd w:id="111"/>
-    <w:bookmarkStart w:id="112" w:name="risk-adjusted-roi"/>
+    <w:bookmarkEnd w:id="117"/>
+    <w:bookmarkStart w:id="118" w:name="risk-adjusted-roi"/>
     <w:p>
       <w:pPr>
         <w:pStyle w:val="Heading3"/>
@@ -27774,9 +29059,9 @@
         </w:pict>
       </w:r>
     </w:p>
-    <w:bookmarkEnd w:id="112"/>
-    <w:bookmarkEnd w:id="113"/>
-    <w:bookmarkStart w:id="120" w:name="complete-risk-assessment"/>
+    <w:bookmarkEnd w:id="118"/>
+    <w:bookmarkEnd w:id="119"/>
+    <w:bookmarkStart w:id="126" w:name="complete-risk-assessment"/>
     <w:p>
       <w:pPr>
         <w:pStyle w:val="Heading2"/>
@@ -27785,7 +29070,7 @@
         <w:t xml:space="preserve">14. Complete Risk Assessment</w:t>
       </w:r>
     </w:p>
-    <w:bookmarkStart w:id="114" w:name="technical-risks"/>
+    <w:bookmarkStart w:id="120" w:name="technical-risks"/>
     <w:p>
       <w:pPr>
         <w:pStyle w:val="Heading3"/>
@@ -28425,8 +29710,8 @@
         </w:tc>
       </w:tr>
     </w:tbl>
-    <w:bookmarkEnd w:id="114"/>
-    <w:bookmarkStart w:id="115" w:name="execution-risks"/>
+    <w:bookmarkEnd w:id="120"/>
+    <w:bookmarkStart w:id="121" w:name="execution-risks"/>
     <w:p>
       <w:pPr>
         <w:pStyle w:val="Heading3"/>
@@ -28852,8 +30137,8 @@
         </w:tc>
       </w:tr>
     </w:tbl>
-    <w:bookmarkEnd w:id="115"/>
-    <w:bookmarkStart w:id="116" w:name="market-risks"/>
+    <w:bookmarkEnd w:id="121"/>
+    <w:bookmarkStart w:id="122" w:name="market-risks"/>
     <w:p>
       <w:pPr>
         <w:pStyle w:val="Heading3"/>
@@ -29165,8 +30450,8 @@
         </w:tc>
       </w:tr>
     </w:tbl>
-    <w:bookmarkEnd w:id="116"/>
-    <w:bookmarkStart w:id="117" w:name="financial-risks"/>
+    <w:bookmarkEnd w:id="122"/>
+    <w:bookmarkStart w:id="123" w:name="financial-risks"/>
     <w:p>
       <w:pPr>
         <w:pStyle w:val="Heading3"/>
@@ -29421,8 +30706,8 @@
         </w:tc>
       </w:tr>
     </w:tbl>
-    <w:bookmarkEnd w:id="117"/>
-    <w:bookmarkStart w:id="118" w:name="regulatory-compliance-risks"/>
+    <w:bookmarkEnd w:id="123"/>
+    <w:bookmarkStart w:id="124" w:name="regulatory-compliance-risks"/>
     <w:p>
       <w:pPr>
         <w:pStyle w:val="Heading3"/>
@@ -29677,8 +30962,8 @@
         </w:tc>
       </w:tr>
     </w:tbl>
-    <w:bookmarkEnd w:id="118"/>
-    <w:bookmarkStart w:id="119" w:name="risk-mitigation-summary"/>
+    <w:bookmarkEnd w:id="124"/>
+    <w:bookmarkStart w:id="125" w:name="risk-mitigation-summary"/>
     <w:p>
       <w:pPr>
         <w:pStyle w:val="Heading3"/>
@@ -29802,9 +31087,9 @@
         </w:pict>
       </w:r>
     </w:p>
-    <w:bookmarkEnd w:id="119"/>
-    <w:bookmarkEnd w:id="120"/>
-    <w:bookmarkStart w:id="128" w:name="detailed-implementation-plan"/>
+    <w:bookmarkEnd w:id="125"/>
+    <w:bookmarkEnd w:id="126"/>
+    <w:bookmarkStart w:id="134" w:name="detailed-implementation-plan"/>
     <w:p>
       <w:pPr>
         <w:pStyle w:val="Heading2"/>
@@ -29813,7 +31098,7 @@
         <w:t xml:space="preserve">15. Detailed Implementation Plan</w:t>
       </w:r>
     </w:p>
-    <w:bookmarkStart w:id="121" w:name="phase-1-internal-alpha-month-1-2-1"/>
+    <w:bookmarkStart w:id="127" w:name="phase-1-internal-alpha-month-1-2-1"/>
     <w:p>
       <w:pPr>
         <w:pStyle w:val="Heading3"/>
@@ -29978,8 +31263,8 @@
         <w:t xml:space="preserve">8 FTE (all hands)</w:t>
       </w:r>
     </w:p>
-    <w:bookmarkEnd w:id="121"/>
-    <w:bookmarkStart w:id="122" w:name="phase-2-internal-beta-month-3-4-1"/>
+    <w:bookmarkEnd w:id="127"/>
+    <w:bookmarkStart w:id="128" w:name="phase-2-internal-beta-month-3-4-1"/>
     <w:p>
       <w:pPr>
         <w:pStyle w:val="Heading3"/>
@@ -30171,8 +31456,8 @@
         <w:t xml:space="preserve">10 FTE + supporting teams (SPCS, Security)</w:t>
       </w:r>
     </w:p>
-    <w:bookmarkEnd w:id="122"/>
-    <w:bookmarkStart w:id="123" w:name="phase-3-internal-ga-month-5-6-1"/>
+    <w:bookmarkEnd w:id="128"/>
+    <w:bookmarkStart w:id="129" w:name="phase-3-internal-ga-month-5-6-1"/>
     <w:p>
       <w:pPr>
         <w:pStyle w:val="Heading3"/>
@@ -30361,8 +31646,8 @@
         <w:t xml:space="preserve">10 FTE</w:t>
       </w:r>
     </w:p>
-    <w:bookmarkEnd w:id="123"/>
-    <w:bookmarkStart w:id="124" w:name="phase-4-customer-preview-month-7-8"/>
+    <w:bookmarkEnd w:id="129"/>
+    <w:bookmarkStart w:id="130" w:name="phase-4-customer-preview-month-7-8"/>
     <w:p>
       <w:pPr>
         <w:pStyle w:val="Heading3"/>
@@ -30515,8 +31800,8 @@
         <w:t xml:space="preserve">10 FTE + 3 SREs</w:t>
       </w:r>
     </w:p>
-    <w:bookmarkEnd w:id="124"/>
-    <w:bookmarkStart w:id="125" w:name="phase-5-alternative-backends-month-9-12"/>
+    <w:bookmarkEnd w:id="130"/>
+    <w:bookmarkStart w:id="131" w:name="phase-5-alternative-backends-month-9-12"/>
     <w:p>
       <w:pPr>
         <w:pStyle w:val="Heading3"/>
@@ -30663,8 +31948,8 @@
         <w:t xml:space="preserve">8 FTE (2 moved to maintenance/support)</w:t>
       </w:r>
     </w:p>
-    <w:bookmarkEnd w:id="125"/>
-    <w:bookmarkStart w:id="126" w:name="critical-path-dependencies"/>
+    <w:bookmarkEnd w:id="131"/>
+    <w:bookmarkStart w:id="132" w:name="critical-path-dependencies"/>
     <w:p>
       <w:pPr>
         <w:pStyle w:val="Heading3"/>
@@ -30759,8 +32044,8 @@
         <w:t xml:space="preserve">- Internal validation → GO/NO-GO → Public beta</w:t>
       </w:r>
     </w:p>
-    <w:bookmarkEnd w:id="126"/>
-    <w:bookmarkStart w:id="127" w:name="gono-go-decision-points"/>
+    <w:bookmarkEnd w:id="132"/>
+    <w:bookmarkStart w:id="133" w:name="gono-go-decision-points"/>
     <w:p>
       <w:pPr>
         <w:pStyle w:val="Heading3"/>
@@ -31039,9 +32324,9 @@
         </w:pict>
       </w:r>
     </w:p>
-    <w:bookmarkEnd w:id="127"/>
-    <w:bookmarkEnd w:id="128"/>
-    <w:bookmarkStart w:id="129" w:name="risks-mitigations"/>
+    <w:bookmarkEnd w:id="133"/>
+    <w:bookmarkEnd w:id="134"/>
+    <w:bookmarkStart w:id="135" w:name="risks-mitigations"/>
     <w:p>
       <w:pPr>
         <w:pStyle w:val="Heading2"/>
@@ -31474,8 +32759,8 @@
         </w:pict>
       </w:r>
     </w:p>
-    <w:bookmarkEnd w:id="129"/>
-    <w:bookmarkStart w:id="130" w:name="dependencies"/>
+    <w:bookmarkEnd w:id="135"/>
+    <w:bookmarkStart w:id="136" w:name="dependencies"/>
     <w:p>
       <w:pPr>
         <w:pStyle w:val="Heading2"/>
@@ -31751,8 +33036,8 @@
         </w:pict>
       </w:r>
     </w:p>
-    <w:bookmarkEnd w:id="130"/>
-    <w:bookmarkStart w:id="147" w:name="openflow-integration"/>
+    <w:bookmarkEnd w:id="136"/>
+    <w:bookmarkStart w:id="153" w:name="openflow-integration"/>
     <w:p>
       <w:pPr>
         <w:pStyle w:val="Heading2"/>
@@ -31761,7 +33046,7 @@
         <w:t xml:space="preserve">18. OpenFlow Integration</w:t>
       </w:r>
     </w:p>
-    <w:bookmarkStart w:id="131" w:name="overview"/>
+    <w:bookmarkStart w:id="137" w:name="overview"/>
     <w:p>
       <w:pPr>
         <w:pStyle w:val="Heading3"/>
@@ -31778,8 +33063,8 @@
         <w:t xml:space="preserve">OpenFlow is Snowflake’s workflow orchestration framework for coordinating multi-step data pipelines and ML workflows. The serverless platform must integrate seamlessly with OpenFlow to enable declarative workflow definitions without infrastructure complexity.</w:t>
       </w:r>
     </w:p>
-    <w:bookmarkEnd w:id="131"/>
-    <w:bookmarkStart w:id="132" w:name="current-openflow-spcs-pattern"/>
+    <w:bookmarkEnd w:id="137"/>
+    <w:bookmarkStart w:id="138" w:name="current-openflow-spcs-pattern"/>
     <w:p>
       <w:pPr>
         <w:pStyle w:val="Heading3"/>
@@ -32087,8 +33372,8 @@
         <w:t xml:space="preserve">- Resource estimation</w:t>
       </w:r>
     </w:p>
-    <w:bookmarkEnd w:id="132"/>
-    <w:bookmarkStart w:id="133" w:name="proposed-serverless-openflow-integration"/>
+    <w:bookmarkEnd w:id="138"/>
+    <w:bookmarkStart w:id="139" w:name="proposed-serverless-openflow-integration"/>
     <w:p>
       <w:pPr>
         <w:pStyle w:val="Heading3"/>
@@ -32375,8 +33660,8 @@
         <w:t xml:space="preserve">- State management</w:t>
       </w:r>
     </w:p>
-    <w:bookmarkEnd w:id="133"/>
-    <w:bookmarkStart w:id="134" w:name="integration-architecture"/>
+    <w:bookmarkEnd w:id="139"/>
+    <w:bookmarkStart w:id="140" w:name="integration-architecture"/>
     <w:p>
       <w:pPr>
         <w:pStyle w:val="Heading3"/>
@@ -32720,8 +34005,8 @@
         <w:t xml:space="preserve">└─────────────────────────────────────────────────────────────────┘</w:t>
       </w:r>
     </w:p>
-    <w:bookmarkEnd w:id="134"/>
-    <w:bookmarkStart w:id="135" w:name="api-design-for-workflows"/>
+    <w:bookmarkEnd w:id="140"/>
+    <w:bookmarkStart w:id="141" w:name="api-design-for-workflows"/>
     <w:p>
       <w:pPr>
         <w:pStyle w:val="Heading3"/>
@@ -33770,8 +35055,8 @@
         <w:t xml:space="preserve"> run.logs()</w:t>
       </w:r>
     </w:p>
-    <w:bookmarkEnd w:id="135"/>
-    <w:bookmarkStart w:id="139" w:name="advanced-workflow-patterns"/>
+    <w:bookmarkEnd w:id="141"/>
+    <w:bookmarkStart w:id="145" w:name="advanced-workflow-patterns"/>
     <w:p>
       <w:pPr>
         <w:pStyle w:val="Heading3"/>
@@ -33780,7 +35065,7 @@
         <w:t xml:space="preserve">18.6 Advanced Workflow Patterns</w:t>
       </w:r>
     </w:p>
-    <w:bookmarkStart w:id="136" w:name="pattern-1-parallel-fan-out"/>
+    <w:bookmarkStart w:id="142" w:name="pattern-1-parallel-fan-out"/>
     <w:p>
       <w:pPr>
         <w:pStyle w:val="Heading4"/>
@@ -34169,8 +35454,8 @@
         <w:t xml:space="preserve">)])</w:t>
       </w:r>
     </w:p>
-    <w:bookmarkEnd w:id="136"/>
-    <w:bookmarkStart w:id="137" w:name="pattern-2-conditional-branching"/>
+    <w:bookmarkEnd w:id="142"/>
+    <w:bookmarkStart w:id="143" w:name="pattern-2-conditional-branching"/>
     <w:p>
       <w:pPr>
         <w:pStyle w:val="Heading4"/>
@@ -34478,8 +35763,8 @@
         <w:t xml:space="preserve">)</w:t>
       </w:r>
     </w:p>
-    <w:bookmarkEnd w:id="137"/>
-    <w:bookmarkStart w:id="138" w:name="pattern-3-scheduled-workflows"/>
+    <w:bookmarkEnd w:id="143"/>
+    <w:bookmarkStart w:id="144" w:name="pattern-3-scheduled-workflows"/>
     <w:p>
       <w:pPr>
         <w:pStyle w:val="Heading4"/>
@@ -34682,9 +35967,9 @@
         <w:t xml:space="preserve">workflow.deploy()</w:t>
       </w:r>
     </w:p>
-    <w:bookmarkEnd w:id="138"/>
-    <w:bookmarkEnd w:id="139"/>
-    <w:bookmarkStart w:id="140" w:name="data-passing-between-tasks"/>
+    <w:bookmarkEnd w:id="144"/>
+    <w:bookmarkEnd w:id="145"/>
+    <w:bookmarkStart w:id="146" w:name="data-passing-between-tasks"/>
     <w:p>
       <w:pPr>
         <w:pStyle w:val="Heading3"/>
@@ -35208,8 +36493,8 @@
         <w:t xml:space="preserve"> pd.read_parquet(input_path)</w:t>
       </w:r>
     </w:p>
-    <w:bookmarkEnd w:id="140"/>
-    <w:bookmarkStart w:id="141" w:name="monitoring-and-observability"/>
+    <w:bookmarkEnd w:id="146"/>
+    <w:bookmarkStart w:id="147" w:name="monitoring-and-observability"/>
     <w:p>
       <w:pPr>
         <w:pStyle w:val="Heading3"/>
@@ -35931,8 +37216,8 @@
         <w:t xml:space="preserve">)</w:t>
       </w:r>
     </w:p>
-    <w:bookmarkEnd w:id="141"/>
-    <w:bookmarkStart w:id="142" w:name="X991b66af83e618c347003a5d63f71bad156f3da"/>
+    <w:bookmarkEnd w:id="147"/>
+    <w:bookmarkStart w:id="148" w:name="X991b66af83e618c347003a5d63f71bad156f3da"/>
     <w:p>
       <w:pPr>
         <w:pStyle w:val="Heading3"/>
@@ -35951,312 +37236,6 @@
           <w:bCs/>
         </w:rPr>
         <w:t xml:space="preserve">Migration path for existing OpenFlow workflows:</w:t>
-      </w:r>
-    </w:p>
-    <w:p>
-      <w:pPr>
-        <w:pStyle w:val="Compact"/>
-        <w:numPr>
-          <w:ilvl w:val="0"/>
-          <w:numId w:val="1022"/>
-        </w:numPr>
-      </w:pPr>
-      <w:r>
-        <w:rPr>
-          <w:b/>
-          <w:bCs/>
-        </w:rPr>
-        <w:t xml:space="preserve">Phase 1: Hybrid Mode</w:t>
-      </w:r>
-      <w:r>
-        <w:t xml:space="preserve"> </w:t>
-      </w:r>
-      <w:r>
-        <w:t xml:space="preserve">(backward compatible)</w:t>
-      </w:r>
-    </w:p>
-    <w:p>
-      <w:pPr>
-        <w:pStyle w:val="SourceCode"/>
-      </w:pPr>
-      <w:r>
-        <w:rPr>
-          <w:rStyle w:val="CommentTok"/>
-        </w:rPr>
-        <w:t xml:space="preserve"># Existing SPCS tasks continue to work</w:t>
-      </w:r>
-      <w:r>
-        <w:br/>
-      </w:r>
-      <w:r>
-        <w:rPr>
-          <w:rStyle w:val="FunctionTok"/>
-        </w:rPr>
-        <w:t xml:space="preserve">tasks</w:t>
-      </w:r>
-      <w:r>
-        <w:rPr>
-          <w:rStyle w:val="KeywordTok"/>
-        </w:rPr>
-        <w:t xml:space="preserve">:</w:t>
-      </w:r>
-      <w:r>
-        <w:br/>
-      </w:r>
-      <w:r>
-        <w:rPr>
-          <w:rStyle w:val="AttributeTok"/>
-        </w:rPr>
-        <w:t xml:space="preserve">  </w:t>
-      </w:r>
-      <w:r>
-        <w:rPr>
-          <w:rStyle w:val="KeywordTok"/>
-        </w:rPr>
-        <w:t xml:space="preserve">-</w:t>
-      </w:r>
-      <w:r>
-        <w:rPr>
-          <w:rStyle w:val="AttributeTok"/>
-        </w:rPr>
-        <w:t xml:space="preserve"> </w:t>
-      </w:r>
-      <w:r>
-        <w:rPr>
-          <w:rStyle w:val="FunctionTok"/>
-        </w:rPr>
-        <w:t xml:space="preserve">id</w:t>
-      </w:r>
-      <w:r>
-        <w:rPr>
-          <w:rStyle w:val="KeywordTok"/>
-        </w:rPr>
-        <w:t xml:space="preserve">:</w:t>
-      </w:r>
-      <w:r>
-        <w:rPr>
-          <w:rStyle w:val="AttributeTok"/>
-        </w:rPr>
-        <w:t xml:space="preserve"> legacy_task</w:t>
-      </w:r>
-      <w:r>
-        <w:br/>
-      </w:r>
-      <w:r>
-        <w:rPr>
-          <w:rStyle w:val="AttributeTok"/>
-        </w:rPr>
-        <w:t xml:space="preserve">    </w:t>
-      </w:r>
-      <w:r>
-        <w:rPr>
-          <w:rStyle w:val="FunctionTok"/>
-        </w:rPr>
-        <w:t xml:space="preserve">type</w:t>
-      </w:r>
-      <w:r>
-        <w:rPr>
-          <w:rStyle w:val="KeywordTok"/>
-        </w:rPr>
-        <w:t xml:space="preserve">:</w:t>
-      </w:r>
-      <w:r>
-        <w:rPr>
-          <w:rStyle w:val="AttributeTok"/>
-        </w:rPr>
-        <w:t xml:space="preserve"> spcs_job</w:t>
-      </w:r>
-      <w:r>
-        <w:br/>
-      </w:r>
-      <w:r>
-        <w:rPr>
-          <w:rStyle w:val="AttributeTok"/>
-        </w:rPr>
-        <w:t xml:space="preserve">    </w:t>
-      </w:r>
-      <w:r>
-        <w:rPr>
-          <w:rStyle w:val="FunctionTok"/>
-        </w:rPr>
-        <w:t xml:space="preserve">config</w:t>
-      </w:r>
-      <w:r>
-        <w:rPr>
-          <w:rStyle w:val="KeywordTok"/>
-        </w:rPr>
-        <w:t xml:space="preserve">:</w:t>
-      </w:r>
-      <w:r>
-        <w:br/>
-      </w:r>
-      <w:r>
-        <w:rPr>
-          <w:rStyle w:val="AttributeTok"/>
-        </w:rPr>
-        <w:t xml:space="preserve">      </w:t>
-      </w:r>
-      <w:r>
-        <w:rPr>
-          <w:rStyle w:val="FunctionTok"/>
-        </w:rPr>
-        <w:t xml:space="preserve">compute_pool</w:t>
-      </w:r>
-      <w:r>
-        <w:rPr>
-          <w:rStyle w:val="KeywordTok"/>
-        </w:rPr>
-        <w:t xml:space="preserve">:</w:t>
-      </w:r>
-      <w:r>
-        <w:rPr>
-          <w:rStyle w:val="AttributeTok"/>
-        </w:rPr>
-        <w:t xml:space="preserve"> MY_POOL</w:t>
-      </w:r>
-      <w:r>
-        <w:br/>
-      </w:r>
-      <w:r>
-        <w:rPr>
-          <w:rStyle w:val="AttributeTok"/>
-        </w:rPr>
-        <w:t xml:space="preserve">      </w:t>
-      </w:r>
-      <w:r>
-        <w:rPr>
-          <w:rStyle w:val="FunctionTok"/>
-        </w:rPr>
-        <w:t xml:space="preserve">image</w:t>
-      </w:r>
-      <w:r>
-        <w:rPr>
-          <w:rStyle w:val="KeywordTok"/>
-        </w:rPr>
-        <w:t xml:space="preserve">:</w:t>
-      </w:r>
-      <w:r>
-        <w:rPr>
-          <w:rStyle w:val="AttributeTok"/>
-        </w:rPr>
-        <w:t xml:space="preserve"> legacy:v1</w:t>
-      </w:r>
-      <w:r>
-        <w:br/>
-      </w:r>
-      <w:r>
-        <w:br/>
-      </w:r>
-      <w:r>
-        <w:rPr>
-          <w:rStyle w:val="CommentTok"/>
-        </w:rPr>
-        <w:t xml:space="preserve">  # New serverless tasks coexist</w:t>
-      </w:r>
-      <w:r>
-        <w:br/>
-      </w:r>
-      <w:r>
-        <w:rPr>
-          <w:rStyle w:val="AttributeTok"/>
-        </w:rPr>
-        <w:t xml:space="preserve">  </w:t>
-      </w:r>
-      <w:r>
-        <w:rPr>
-          <w:rStyle w:val="KeywordTok"/>
-        </w:rPr>
-        <w:t xml:space="preserve">-</w:t>
-      </w:r>
-      <w:r>
-        <w:rPr>
-          <w:rStyle w:val="AttributeTok"/>
-        </w:rPr>
-        <w:t xml:space="preserve"> </w:t>
-      </w:r>
-      <w:r>
-        <w:rPr>
-          <w:rStyle w:val="FunctionTok"/>
-        </w:rPr>
-        <w:t xml:space="preserve">id</w:t>
-      </w:r>
-      <w:r>
-        <w:rPr>
-          <w:rStyle w:val="KeywordTok"/>
-        </w:rPr>
-        <w:t xml:space="preserve">:</w:t>
-      </w:r>
-      <w:r>
-        <w:rPr>
-          <w:rStyle w:val="AttributeTok"/>
-        </w:rPr>
-        <w:t xml:space="preserve"> new_task</w:t>
-      </w:r>
-      <w:r>
-        <w:br/>
-      </w:r>
-      <w:r>
-        <w:rPr>
-          <w:rStyle w:val="AttributeTok"/>
-        </w:rPr>
-        <w:t xml:space="preserve">    </w:t>
-      </w:r>
-      <w:r>
-        <w:rPr>
-          <w:rStyle w:val="FunctionTok"/>
-        </w:rPr>
-        <w:t xml:space="preserve">type</w:t>
-      </w:r>
-      <w:r>
-        <w:rPr>
-          <w:rStyle w:val="KeywordTok"/>
-        </w:rPr>
-        <w:t xml:space="preserve">:</w:t>
-      </w:r>
-      <w:r>
-        <w:rPr>
-          <w:rStyle w:val="AttributeTok"/>
-        </w:rPr>
-        <w:t xml:space="preserve"> serverless_function</w:t>
-      </w:r>
-      <w:r>
-        <w:br/>
-      </w:r>
-      <w:r>
-        <w:rPr>
-          <w:rStyle w:val="AttributeTok"/>
-        </w:rPr>
-        <w:t xml:space="preserve">    </w:t>
-      </w:r>
-      <w:r>
-        <w:rPr>
-          <w:rStyle w:val="FunctionTok"/>
-        </w:rPr>
-        <w:t xml:space="preserve">function_ref</w:t>
-      </w:r>
-      <w:r>
-        <w:rPr>
-          <w:rStyle w:val="KeywordTok"/>
-        </w:rPr>
-        <w:t xml:space="preserve">:</w:t>
-      </w:r>
-      <w:r>
-        <w:rPr>
-          <w:rStyle w:val="AttributeTok"/>
-        </w:rPr>
-        <w:t xml:space="preserve"> </w:t>
-      </w:r>
-      <w:r>
-        <w:rPr>
-          <w:rStyle w:val="StringTok"/>
-        </w:rPr>
-        <w:t xml:space="preserve">"my_function"</w:t>
-      </w:r>
-      <w:r>
-        <w:rPr>
-          <w:rStyle w:val="CommentTok"/>
-        </w:rPr>
-        <w:t xml:space="preserve">  # References sf.function()</w:t>
       </w:r>
     </w:p>
     <w:p>
@@ -36272,6 +37251,312 @@
           <w:b/>
           <w:bCs/>
         </w:rPr>
+        <w:t xml:space="preserve">Phase 1: Hybrid Mode</w:t>
+      </w:r>
+      <w:r>
+        <w:t xml:space="preserve"> </w:t>
+      </w:r>
+      <w:r>
+        <w:t xml:space="preserve">(backward compatible)</w:t>
+      </w:r>
+    </w:p>
+    <w:p>
+      <w:pPr>
+        <w:pStyle w:val="SourceCode"/>
+      </w:pPr>
+      <w:r>
+        <w:rPr>
+          <w:rStyle w:val="CommentTok"/>
+        </w:rPr>
+        <w:t xml:space="preserve"># Existing SPCS tasks continue to work</w:t>
+      </w:r>
+      <w:r>
+        <w:br/>
+      </w:r>
+      <w:r>
+        <w:rPr>
+          <w:rStyle w:val="FunctionTok"/>
+        </w:rPr>
+        <w:t xml:space="preserve">tasks</w:t>
+      </w:r>
+      <w:r>
+        <w:rPr>
+          <w:rStyle w:val="KeywordTok"/>
+        </w:rPr>
+        <w:t xml:space="preserve">:</w:t>
+      </w:r>
+      <w:r>
+        <w:br/>
+      </w:r>
+      <w:r>
+        <w:rPr>
+          <w:rStyle w:val="AttributeTok"/>
+        </w:rPr>
+        <w:t xml:space="preserve">  </w:t>
+      </w:r>
+      <w:r>
+        <w:rPr>
+          <w:rStyle w:val="KeywordTok"/>
+        </w:rPr>
+        <w:t xml:space="preserve">-</w:t>
+      </w:r>
+      <w:r>
+        <w:rPr>
+          <w:rStyle w:val="AttributeTok"/>
+        </w:rPr>
+        <w:t xml:space="preserve"> </w:t>
+      </w:r>
+      <w:r>
+        <w:rPr>
+          <w:rStyle w:val="FunctionTok"/>
+        </w:rPr>
+        <w:t xml:space="preserve">id</w:t>
+      </w:r>
+      <w:r>
+        <w:rPr>
+          <w:rStyle w:val="KeywordTok"/>
+        </w:rPr>
+        <w:t xml:space="preserve">:</w:t>
+      </w:r>
+      <w:r>
+        <w:rPr>
+          <w:rStyle w:val="AttributeTok"/>
+        </w:rPr>
+        <w:t xml:space="preserve"> legacy_task</w:t>
+      </w:r>
+      <w:r>
+        <w:br/>
+      </w:r>
+      <w:r>
+        <w:rPr>
+          <w:rStyle w:val="AttributeTok"/>
+        </w:rPr>
+        <w:t xml:space="preserve">    </w:t>
+      </w:r>
+      <w:r>
+        <w:rPr>
+          <w:rStyle w:val="FunctionTok"/>
+        </w:rPr>
+        <w:t xml:space="preserve">type</w:t>
+      </w:r>
+      <w:r>
+        <w:rPr>
+          <w:rStyle w:val="KeywordTok"/>
+        </w:rPr>
+        <w:t xml:space="preserve">:</w:t>
+      </w:r>
+      <w:r>
+        <w:rPr>
+          <w:rStyle w:val="AttributeTok"/>
+        </w:rPr>
+        <w:t xml:space="preserve"> spcs_job</w:t>
+      </w:r>
+      <w:r>
+        <w:br/>
+      </w:r>
+      <w:r>
+        <w:rPr>
+          <w:rStyle w:val="AttributeTok"/>
+        </w:rPr>
+        <w:t xml:space="preserve">    </w:t>
+      </w:r>
+      <w:r>
+        <w:rPr>
+          <w:rStyle w:val="FunctionTok"/>
+        </w:rPr>
+        <w:t xml:space="preserve">config</w:t>
+      </w:r>
+      <w:r>
+        <w:rPr>
+          <w:rStyle w:val="KeywordTok"/>
+        </w:rPr>
+        <w:t xml:space="preserve">:</w:t>
+      </w:r>
+      <w:r>
+        <w:br/>
+      </w:r>
+      <w:r>
+        <w:rPr>
+          <w:rStyle w:val="AttributeTok"/>
+        </w:rPr>
+        <w:t xml:space="preserve">      </w:t>
+      </w:r>
+      <w:r>
+        <w:rPr>
+          <w:rStyle w:val="FunctionTok"/>
+        </w:rPr>
+        <w:t xml:space="preserve">compute_pool</w:t>
+      </w:r>
+      <w:r>
+        <w:rPr>
+          <w:rStyle w:val="KeywordTok"/>
+        </w:rPr>
+        <w:t xml:space="preserve">:</w:t>
+      </w:r>
+      <w:r>
+        <w:rPr>
+          <w:rStyle w:val="AttributeTok"/>
+        </w:rPr>
+        <w:t xml:space="preserve"> MY_POOL</w:t>
+      </w:r>
+      <w:r>
+        <w:br/>
+      </w:r>
+      <w:r>
+        <w:rPr>
+          <w:rStyle w:val="AttributeTok"/>
+        </w:rPr>
+        <w:t xml:space="preserve">      </w:t>
+      </w:r>
+      <w:r>
+        <w:rPr>
+          <w:rStyle w:val="FunctionTok"/>
+        </w:rPr>
+        <w:t xml:space="preserve">image</w:t>
+      </w:r>
+      <w:r>
+        <w:rPr>
+          <w:rStyle w:val="KeywordTok"/>
+        </w:rPr>
+        <w:t xml:space="preserve">:</w:t>
+      </w:r>
+      <w:r>
+        <w:rPr>
+          <w:rStyle w:val="AttributeTok"/>
+        </w:rPr>
+        <w:t xml:space="preserve"> legacy:v1</w:t>
+      </w:r>
+      <w:r>
+        <w:br/>
+      </w:r>
+      <w:r>
+        <w:br/>
+      </w:r>
+      <w:r>
+        <w:rPr>
+          <w:rStyle w:val="CommentTok"/>
+        </w:rPr>
+        <w:t xml:space="preserve">  # New serverless tasks coexist</w:t>
+      </w:r>
+      <w:r>
+        <w:br/>
+      </w:r>
+      <w:r>
+        <w:rPr>
+          <w:rStyle w:val="AttributeTok"/>
+        </w:rPr>
+        <w:t xml:space="preserve">  </w:t>
+      </w:r>
+      <w:r>
+        <w:rPr>
+          <w:rStyle w:val="KeywordTok"/>
+        </w:rPr>
+        <w:t xml:space="preserve">-</w:t>
+      </w:r>
+      <w:r>
+        <w:rPr>
+          <w:rStyle w:val="AttributeTok"/>
+        </w:rPr>
+        <w:t xml:space="preserve"> </w:t>
+      </w:r>
+      <w:r>
+        <w:rPr>
+          <w:rStyle w:val="FunctionTok"/>
+        </w:rPr>
+        <w:t xml:space="preserve">id</w:t>
+      </w:r>
+      <w:r>
+        <w:rPr>
+          <w:rStyle w:val="KeywordTok"/>
+        </w:rPr>
+        <w:t xml:space="preserve">:</w:t>
+      </w:r>
+      <w:r>
+        <w:rPr>
+          <w:rStyle w:val="AttributeTok"/>
+        </w:rPr>
+        <w:t xml:space="preserve"> new_task</w:t>
+      </w:r>
+      <w:r>
+        <w:br/>
+      </w:r>
+      <w:r>
+        <w:rPr>
+          <w:rStyle w:val="AttributeTok"/>
+        </w:rPr>
+        <w:t xml:space="preserve">    </w:t>
+      </w:r>
+      <w:r>
+        <w:rPr>
+          <w:rStyle w:val="FunctionTok"/>
+        </w:rPr>
+        <w:t xml:space="preserve">type</w:t>
+      </w:r>
+      <w:r>
+        <w:rPr>
+          <w:rStyle w:val="KeywordTok"/>
+        </w:rPr>
+        <w:t xml:space="preserve">:</w:t>
+      </w:r>
+      <w:r>
+        <w:rPr>
+          <w:rStyle w:val="AttributeTok"/>
+        </w:rPr>
+        <w:t xml:space="preserve"> serverless_function</w:t>
+      </w:r>
+      <w:r>
+        <w:br/>
+      </w:r>
+      <w:r>
+        <w:rPr>
+          <w:rStyle w:val="AttributeTok"/>
+        </w:rPr>
+        <w:t xml:space="preserve">    </w:t>
+      </w:r>
+      <w:r>
+        <w:rPr>
+          <w:rStyle w:val="FunctionTok"/>
+        </w:rPr>
+        <w:t xml:space="preserve">function_ref</w:t>
+      </w:r>
+      <w:r>
+        <w:rPr>
+          <w:rStyle w:val="KeywordTok"/>
+        </w:rPr>
+        <w:t xml:space="preserve">:</w:t>
+      </w:r>
+      <w:r>
+        <w:rPr>
+          <w:rStyle w:val="AttributeTok"/>
+        </w:rPr>
+        <w:t xml:space="preserve"> </w:t>
+      </w:r>
+      <w:r>
+        <w:rPr>
+          <w:rStyle w:val="StringTok"/>
+        </w:rPr>
+        <w:t xml:space="preserve">"my_function"</w:t>
+      </w:r>
+      <w:r>
+        <w:rPr>
+          <w:rStyle w:val="CommentTok"/>
+        </w:rPr>
+        <w:t xml:space="preserve">  # References sf.function()</w:t>
+      </w:r>
+    </w:p>
+    <w:p>
+      <w:pPr>
+        <w:pStyle w:val="Compact"/>
+        <w:numPr>
+          <w:ilvl w:val="0"/>
+          <w:numId w:val="1024"/>
+        </w:numPr>
+      </w:pPr>
+      <w:r>
+        <w:rPr>
+          <w:b/>
+          <w:bCs/>
+        </w:rPr>
         <w:t xml:space="preserve">Phase 2: Full Migration</w:t>
       </w:r>
     </w:p>
@@ -36343,8 +37628,8 @@
         <w:t xml:space="preserve">workflow.deploy()</w:t>
       </w:r>
     </w:p>
-    <w:bookmarkEnd w:id="142"/>
-    <w:bookmarkStart w:id="143" w:name="benefits-of-serverless-openflow"/>
+    <w:bookmarkEnd w:id="148"/>
+    <w:bookmarkStart w:id="149" w:name="benefits-of-serverless-openflow"/>
     <w:p>
       <w:pPr>
         <w:pStyle w:val="Heading3"/>
@@ -36820,8 +38105,8 @@
         </w:tc>
       </w:tr>
     </w:tbl>
-    <w:bookmarkEnd w:id="143"/>
-    <w:bookmarkStart w:id="145" w:name="requirements-for-integration"/>
+    <w:bookmarkEnd w:id="149"/>
+    <w:bookmarkStart w:id="151" w:name="requirements-for-integration"/>
     <w:p>
       <w:pPr>
         <w:pStyle w:val="Heading3"/>
@@ -36830,7 +38115,7 @@
         <w:t xml:space="preserve">18.11 Requirements for Integration</w:t>
       </w:r>
     </w:p>
-    <w:bookmarkStart w:id="144" w:name="fr13-openflow-integration"/>
+    <w:bookmarkStart w:id="150" w:name="fr13-openflow-integration"/>
     <w:p>
       <w:pPr>
         <w:pStyle w:val="Heading4"/>
@@ -37290,9 +38575,9 @@
         </w:tc>
       </w:tr>
     </w:tbl>
-    <w:bookmarkEnd w:id="144"/>
-    <w:bookmarkEnd w:id="145"/>
-    <w:bookmarkStart w:id="146" w:name="implementation-notes"/>
+    <w:bookmarkEnd w:id="150"/>
+    <w:bookmarkEnd w:id="151"/>
+    <w:bookmarkStart w:id="152" w:name="implementation-notes"/>
     <w:p>
       <w:pPr>
         <w:pStyle w:val="Heading3"/>
@@ -37311,113 +38596,6 @@
           <w:bCs/>
         </w:rPr>
         <w:t xml:space="preserve">Backend Integration Points:</w:t>
-      </w:r>
-    </w:p>
-    <w:p>
-      <w:pPr>
-        <w:pStyle w:val="Compact"/>
-        <w:numPr>
-          <w:ilvl w:val="0"/>
-          <w:numId w:val="1024"/>
-        </w:numPr>
-      </w:pPr>
-      <w:r>
-        <w:rPr>
-          <w:b/>
-          <w:bCs/>
-        </w:rPr>
-        <w:t xml:space="preserve">Function Registry</w:t>
-      </w:r>
-      <w:r>
-        <w:t xml:space="preserve">: Serverless functions register with OpenFlow’s task registry</w:t>
-      </w:r>
-    </w:p>
-    <w:p>
-      <w:pPr>
-        <w:pStyle w:val="Compact"/>
-        <w:numPr>
-          <w:ilvl w:val="0"/>
-          <w:numId w:val="1024"/>
-        </w:numPr>
-      </w:pPr>
-      <w:r>
-        <w:rPr>
-          <w:b/>
-          <w:bCs/>
-        </w:rPr>
-        <w:t xml:space="preserve">State Management</w:t>
-      </w:r>
-      <w:r>
-        <w:t xml:space="preserve">: OpenFlow tracks serverless function execution state</w:t>
-      </w:r>
-    </w:p>
-    <w:p>
-      <w:pPr>
-        <w:pStyle w:val="Compact"/>
-        <w:numPr>
-          <w:ilvl w:val="0"/>
-          <w:numId w:val="1024"/>
-        </w:numPr>
-      </w:pPr>
-      <w:r>
-        <w:rPr>
-          <w:b/>
-          <w:bCs/>
-        </w:rPr>
-        <w:t xml:space="preserve">Resource Allocation</w:t>
-      </w:r>
-      <w:r>
-        <w:t xml:space="preserve">: Serverless platform communicates available capacity to OpenFlow</w:t>
-      </w:r>
-    </w:p>
-    <w:p>
-      <w:pPr>
-        <w:pStyle w:val="Compact"/>
-        <w:numPr>
-          <w:ilvl w:val="0"/>
-          <w:numId w:val="1024"/>
-        </w:numPr>
-      </w:pPr>
-      <w:r>
-        <w:rPr>
-          <w:b/>
-          <w:bCs/>
-        </w:rPr>
-        <w:t xml:space="preserve">Failure Handling</w:t>
-      </w:r>
-      <w:r>
-        <w:t xml:space="preserve">: OpenFlow’s retry logic works transparently with serverless functions</w:t>
-      </w:r>
-    </w:p>
-    <w:p>
-      <w:pPr>
-        <w:pStyle w:val="Compact"/>
-        <w:numPr>
-          <w:ilvl w:val="0"/>
-          <w:numId w:val="1024"/>
-        </w:numPr>
-      </w:pPr>
-      <w:r>
-        <w:rPr>
-          <w:b/>
-          <w:bCs/>
-        </w:rPr>
-        <w:t xml:space="preserve">Data Lineage</w:t>
-      </w:r>
-      <w:r>
-        <w:t xml:space="preserve">: Track data flow through workflow stages automatically</w:t>
-      </w:r>
-    </w:p>
-    <w:p>
-      <w:pPr>
-        <w:pStyle w:val="FirstParagraph"/>
-      </w:pPr>
-      <w:r>
-        <w:rPr>
-          <w:b/>
-          <w:bCs/>
-        </w:rPr>
-        <w:t xml:space="preserve">Technical Considerations:</w:t>
       </w:r>
     </w:p>
     <w:p>
@@ -37429,7 +38607,14 @@
         </w:numPr>
       </w:pPr>
       <w:r>
-        <w:t xml:space="preserve">Serverless functions must support long-running tasks (hours) for ML training</w:t>
+        <w:rPr>
+          <w:b/>
+          <w:bCs/>
+        </w:rPr>
+        <w:t xml:space="preserve">Function Registry</w:t>
+      </w:r>
+      <w:r>
+        <w:t xml:space="preserve">: Serverless functions register with OpenFlow’s task registry</w:t>
       </w:r>
     </w:p>
     <w:p>
@@ -37441,7 +38626,14 @@
         </w:numPr>
       </w:pPr>
       <w:r>
-        <w:t xml:space="preserve">Checkpointing for resumable execution after failures</w:t>
+        <w:rPr>
+          <w:b/>
+          <w:bCs/>
+        </w:rPr>
+        <w:t xml:space="preserve">State Management</w:t>
+      </w:r>
+      <w:r>
+        <w:t xml:space="preserve">: OpenFlow tracks serverless function execution state</w:t>
       </w:r>
     </w:p>
     <w:p>
@@ -37453,7 +38645,14 @@
         </w:numPr>
       </w:pPr>
       <w:r>
-        <w:t xml:space="preserve">Output caching to avoid re-running expensive tasks</w:t>
+        <w:rPr>
+          <w:b/>
+          <w:bCs/>
+        </w:rPr>
+        <w:t xml:space="preserve">Resource Allocation</w:t>
+      </w:r>
+      <w:r>
+        <w:t xml:space="preserve">: Serverless platform communicates available capacity to OpenFlow</w:t>
       </w:r>
     </w:p>
     <w:p>
@@ -37465,6 +38664,92 @@
         </w:numPr>
       </w:pPr>
       <w:r>
+        <w:rPr>
+          <w:b/>
+          <w:bCs/>
+        </w:rPr>
+        <w:t xml:space="preserve">Failure Handling</w:t>
+      </w:r>
+      <w:r>
+        <w:t xml:space="preserve">: OpenFlow’s retry logic works transparently with serverless functions</w:t>
+      </w:r>
+    </w:p>
+    <w:p>
+      <w:pPr>
+        <w:pStyle w:val="Compact"/>
+        <w:numPr>
+          <w:ilvl w:val="0"/>
+          <w:numId w:val="1025"/>
+        </w:numPr>
+      </w:pPr>
+      <w:r>
+        <w:rPr>
+          <w:b/>
+          <w:bCs/>
+        </w:rPr>
+        <w:t xml:space="preserve">Data Lineage</w:t>
+      </w:r>
+      <w:r>
+        <w:t xml:space="preserve">: Track data flow through workflow stages automatically</w:t>
+      </w:r>
+    </w:p>
+    <w:p>
+      <w:pPr>
+        <w:pStyle w:val="FirstParagraph"/>
+      </w:pPr>
+      <w:r>
+        <w:rPr>
+          <w:b/>
+          <w:bCs/>
+        </w:rPr>
+        <w:t xml:space="preserve">Technical Considerations:</w:t>
+      </w:r>
+    </w:p>
+    <w:p>
+      <w:pPr>
+        <w:pStyle w:val="Compact"/>
+        <w:numPr>
+          <w:ilvl w:val="0"/>
+          <w:numId w:val="1026"/>
+        </w:numPr>
+      </w:pPr>
+      <w:r>
+        <w:t xml:space="preserve">Serverless functions must support long-running tasks (hours) for ML training</w:t>
+      </w:r>
+    </w:p>
+    <w:p>
+      <w:pPr>
+        <w:pStyle w:val="Compact"/>
+        <w:numPr>
+          <w:ilvl w:val="0"/>
+          <w:numId w:val="1026"/>
+        </w:numPr>
+      </w:pPr>
+      <w:r>
+        <w:t xml:space="preserve">Checkpointing for resumable execution after failures</w:t>
+      </w:r>
+    </w:p>
+    <w:p>
+      <w:pPr>
+        <w:pStyle w:val="Compact"/>
+        <w:numPr>
+          <w:ilvl w:val="0"/>
+          <w:numId w:val="1026"/>
+        </w:numPr>
+      </w:pPr>
+      <w:r>
+        <w:t xml:space="preserve">Output caching to avoid re-running expensive tasks</w:t>
+      </w:r>
+    </w:p>
+    <w:p>
+      <w:pPr>
+        <w:pStyle w:val="Compact"/>
+        <w:numPr>
+          <w:ilvl w:val="0"/>
+          <w:numId w:val="1026"/>
+        </w:numPr>
+      </w:pPr>
+      <w:r>
         <w:t xml:space="preserve">Cross-workflow function sharing (same function used in multiple workflows)</w:t>
       </w:r>
     </w:p>
@@ -37475,9 +38760,9 @@
         </w:pict>
       </w:r>
     </w:p>
-    <w:bookmarkEnd w:id="146"/>
-    <w:bookmarkEnd w:id="147"/>
-    <w:bookmarkStart w:id="150" w:name="appendix"/>
+    <w:bookmarkEnd w:id="152"/>
+    <w:bookmarkEnd w:id="153"/>
+    <w:bookmarkStart w:id="156" w:name="appendix"/>
     <w:p>
       <w:pPr>
         <w:pStyle w:val="Heading2"/>
@@ -37486,7 +38771,7 @@
         <w:t xml:space="preserve">19. Appendix</w:t>
       </w:r>
     </w:p>
-    <w:bookmarkStart w:id="148" w:name="a.-current-vs-proposed-comparison"/>
+    <w:bookmarkStart w:id="154" w:name="a.-current-vs-proposed-comparison"/>
     <w:p>
       <w:pPr>
         <w:pStyle w:val="Heading3"/>
@@ -38063,8 +39348,8 @@
         <w:t xml:space="preserve"> sf.deploy(my_function)</w:t>
       </w:r>
     </w:p>
-    <w:bookmarkEnd w:id="148"/>
-    <w:bookmarkStart w:id="149" w:name="b.-glossary"/>
+    <w:bookmarkEnd w:id="154"/>
+    <w:bookmarkStart w:id="155" w:name="b.-glossary"/>
     <w:p>
       <w:pPr>
         <w:pStyle w:val="Heading3"/>
@@ -38467,9 +39752,9 @@
         <w:t xml:space="preserve">- v1.0 (Feb 15): Initial draft</w:t>
       </w:r>
     </w:p>
-    <w:bookmarkEnd w:id="149"/>
-    <w:bookmarkEnd w:id="150"/>
-    <w:bookmarkEnd w:id="151"/>
+    <w:bookmarkEnd w:id="155"/>
+    <w:bookmarkEnd w:id="156"/>
+    <w:bookmarkEnd w:id="157"/>
     <w:sectPr>
       <w:footnotePr>
         <w:numRestart w:val="eachSect"/>
@@ -38962,9 +40247,39 @@
     </w:lvlOverride>
   </w:num>
   <w:num w:numId="1009">
+    <w:abstractNumId w:val="99411"/>
+    <w:lvlOverride w:ilvl="0">
+      <w:startOverride w:val="1"/>
+    </w:lvlOverride>
+    <w:lvlOverride w:ilvl="1">
+      <w:startOverride w:val="1"/>
+    </w:lvlOverride>
+    <w:lvlOverride w:ilvl="2">
+      <w:startOverride w:val="1"/>
+    </w:lvlOverride>
+    <w:lvlOverride w:ilvl="3">
+      <w:startOverride w:val="1"/>
+    </w:lvlOverride>
+    <w:lvlOverride w:ilvl="4">
+      <w:startOverride w:val="1"/>
+    </w:lvlOverride>
+    <w:lvlOverride w:ilvl="5">
+      <w:startOverride w:val="1"/>
+    </w:lvlOverride>
+    <w:lvlOverride w:ilvl="6">
+      <w:startOverride w:val="1"/>
+    </w:lvlOverride>
+    <w:lvlOverride w:ilvl="7">
+      <w:startOverride w:val="1"/>
+    </w:lvlOverride>
+    <w:lvlOverride w:ilvl="8">
+      <w:startOverride w:val="1"/>
+    </w:lvlOverride>
+  </w:num>
+  <w:num w:numId="1010">
     <w:abstractNumId w:val="991"/>
   </w:num>
-  <w:num w:numId="1010">
+  <w:num w:numId="1011">
     <w:abstractNumId w:val="99412"/>
     <w:lvlOverride w:ilvl="0">
       <w:startOverride w:val="2"/>
@@ -38994,13 +40309,13 @@
       <w:startOverride w:val="2"/>
     </w:lvlOverride>
   </w:num>
-  <w:num w:numId="1011">
-    <w:abstractNumId w:val="991"/>
-  </w:num>
   <w:num w:numId="1012">
     <w:abstractNumId w:val="991"/>
   </w:num>
   <w:num w:numId="1013">
+    <w:abstractNumId w:val="991"/>
+  </w:num>
+  <w:num w:numId="1014">
     <w:abstractNumId w:val="99412"/>
     <w:lvlOverride w:ilvl="0">
       <w:startOverride w:val="2"/>
@@ -39030,9 +40345,6 @@
       <w:startOverride w:val="2"/>
     </w:lvlOverride>
   </w:num>
-  <w:num w:numId="1014">
-    <w:abstractNumId w:val="991"/>
-  </w:num>
   <w:num w:numId="1015">
     <w:abstractNumId w:val="991"/>
   </w:num>
@@ -39049,6 +40361,9 @@
     <w:abstractNumId w:val="991"/>
   </w:num>
   <w:num w:numId="1020">
+    <w:abstractNumId w:val="991"/>
+  </w:num>
+  <w:num w:numId="1021">
     <w:abstractNumId w:val="99412"/>
     <w:lvlOverride w:ilvl="0">
       <w:startOverride w:val="2"/>
@@ -39078,10 +40393,10 @@
       <w:startOverride w:val="2"/>
     </w:lvlOverride>
   </w:num>
-  <w:num w:numId="1021">
+  <w:num w:numId="1022">
     <w:abstractNumId w:val="991"/>
   </w:num>
-  <w:num w:numId="1022">
+  <w:num w:numId="1023">
     <w:abstractNumId w:val="99411"/>
     <w:lvlOverride w:ilvl="0">
       <w:startOverride w:val="1"/>
@@ -39111,7 +40426,7 @@
       <w:startOverride w:val="1"/>
     </w:lvlOverride>
   </w:num>
-  <w:num w:numId="1023">
+  <w:num w:numId="1024">
     <w:abstractNumId w:val="99412"/>
     <w:lvlOverride w:ilvl="0">
       <w:startOverride w:val="2"/>
@@ -39141,7 +40456,7 @@
       <w:startOverride w:val="2"/>
     </w:lvlOverride>
   </w:num>
-  <w:num w:numId="1024">
+  <w:num w:numId="1025">
     <w:abstractNumId w:val="99411"/>
     <w:lvlOverride w:ilvl="0">
       <w:startOverride w:val="1"/>
@@ -39171,7 +40486,7 @@
       <w:startOverride w:val="1"/>
     </w:lvlOverride>
   </w:num>
-  <w:num w:numId="1025">
+  <w:num w:numId="1026">
     <w:abstractNumId w:val="991"/>
   </w:num>
 </w:numbering>

</xml_diff>